<commit_message>
Publish Townlight Beta 1 Station delivery update (#291)
* Publish Townlight Beta 1 Station delivery update

* Clarify public beta download steps and terms

* Clarify public beta download steps and terms

* Clarify public beta download steps and terms

---------

Co-authored-by: Scott Converse <scottconverse@users.noreply.github.com>
</commit_message>
<xml_diff>
--- a/docs/beta-1/docx/Townlight-Station-Manual-Beta-1.docx
+++ b/docs/beta-1/docx/Townlight-Station-Manual-Beta-1.docx
@@ -26,7 +26,7 @@
         <w:t xml:space="preserve">30 October 2026</w:t>
       </w:r>
     </w:p>
-    <w:bookmarkStart w:id="19" w:name="contents"/>
+    <w:bookmarkStart w:id="20" w:name="contents"/>
     <w:p>
       <w:pPr>
         <w:pStyle w:val="Heading1"/>
@@ -283,8 +283,60 @@
         </w:r>
       </w:hyperlink>
     </w:p>
-    <w:bookmarkEnd w:id="19"/>
-    <w:bookmarkStart w:id="20" w:name="using-this-manual"/>
+    <w:p>
+      <w:pPr>
+        <w:pStyle w:val="BodyText"/>
+      </w:pPr>
+      <w:hyperlink w:anchor="X181e55796f60842f5722441cc567a4aa9d88047">
+        <w:r>
+          <w:rPr>
+            <w:rStyle w:val="Hyperlink"/>
+          </w:rPr>
+          <w:t xml:space="preserve">Completed recordings on YouTube and live CivicCast coverage</w:t>
+        </w:r>
+      </w:hyperlink>
+    </w:p>
+    <w:p>
+      <w:pPr>
+        <w:pStyle w:val="BodyText"/>
+      </w:pPr>
+      <w:hyperlink w:anchor="delivery-subject-index">
+        <w:r>
+          <w:rPr>
+            <w:rStyle w:val="Hyperlink"/>
+          </w:rPr>
+          <w:t xml:space="preserve">Delivery subject index</w:t>
+        </w:r>
+      </w:hyperlink>
+    </w:p>
+    <w:p>
+      <w:pPr>
+        <w:pStyle w:val="BlockText"/>
+      </w:pPr>
+      <w:r>
+        <w:rPr>
+          <w:b/>
+          <w:bCs/>
+        </w:rPr>
+        <w:t xml:space="preserve">Townlight Beta 1 — Station delivery update, 31 October 2026.</w:t>
+      </w:r>
+      <w:r>
+        <w:t xml:space="preserve"> </w:t>
+      </w:r>
+      <w:hyperlink r:id="rId19">
+        <w:r>
+          <w:rPr>
+            <w:rStyle w:val="Hyperlink"/>
+          </w:rPr>
+          <w:t xml:space="preserve">Signed Windows installer, source, documentation and acceptance</w:t>
+        </w:r>
+      </w:hyperlink>
+      <w:r>
+        <w:t xml:space="preserve">. This edition documents the Sandbox-tested Station delivery additions. Existing component versions are retained. Earlier baseline results remain identified as historical evidence; the new acceptance report identifies the new installer.</w:t>
+      </w:r>
+    </w:p>
+    <w:bookmarkEnd w:id="20"/>
+    <w:bookmarkStart w:id="21" w:name="using-this-manual"/>
     <w:p>
       <w:pPr>
         <w:pStyle w:val="Heading1"/>
@@ -310,8 +362,8 @@
         <w:t xml:space="preserve">Staff should begin with First run and Daily workflow. Administrators should also read Architecture, Technical specifications, Configuration, Security and Recovery. Developers should use the exact API/data dictionary and examples. The table of contents and alphabetical subject index link to the relevant sections in the HTML edition; the PDF preserves headings and searchable text. An editable Word edition is included with the same documentation companion.</w:t>
       </w:r>
     </w:p>
-    <w:bookmarkEnd w:id="20"/>
-    <w:bookmarkStart w:id="21" w:name="beta-identity"/>
+    <w:bookmarkEnd w:id="21"/>
+    <w:bookmarkStart w:id="22" w:name="beta-identity"/>
     <w:p>
       <w:pPr>
         <w:pStyle w:val="Heading1"/>
@@ -585,7 +637,7 @@
               <w:rPr>
                 <w:sz w:val="18"/>
               </w:rPr>
-              <w:t xml:space="preserve">Candidate MSI SHA256</w:t>
+              <w:t xml:space="preserve">Candidate artifact identity</w:t>
             </w:r>
           </w:p>
         </w:tc>
@@ -605,10 +657,9 @@
             </w:pPr>
             <w:r>
               <w:rPr>
-                <w:rStyle w:val="VerbatimChar"/>
                 <w:sz w:val="18"/>
               </w:rPr>
-              <w:t xml:space="preserve">98bcdef11ebdf5c767f620c904ff49f85115fde3b5c23f62703b111e645aaf86</w:t>
+              <w:t xml:space="preserve">Station delivery update; use the release SHA256SUMS.txt</w:t>
             </w:r>
           </w:p>
         </w:tc>
@@ -632,7 +683,7 @@
               <w:rPr>
                 <w:sz w:val="18"/>
               </w:rPr>
-              <w:t xml:space="preserve">Corresponding-source SHA256</w:t>
+              <w:t xml:space="preserve">Corresponding source</w:t>
             </w:r>
           </w:p>
         </w:tc>
@@ -652,10 +703,9 @@
             </w:pPr>
             <w:r>
               <w:rPr>
-                <w:rStyle w:val="VerbatimChar"/>
                 <w:sz w:val="18"/>
               </w:rPr>
-              <w:t xml:space="preserve">84a23e1297e42d17b16cfc9e51b2dd78bc46414c0de8ad7ebd2466c1a409d06b</w:t>
+              <w:t xml:space="preserve">Updated Station delivery candidate source companion</w:t>
             </w:r>
           </w:p>
         </w:tc>
@@ -758,11 +808,11 @@
         <w:pStyle w:val="BodyText"/>
       </w:pPr>
       <w:r>
-        <w:t xml:space="preserve">“Townlight Beta 1” identifies this coordinated beta delivery. It does not renumber the installer, native binary, Python packages or historical receipts. Component versions may differ. This documentation is a later companion to unchanged signed bytes, not a rebuilt installer. Historical release pages and manuals describe their own versions and are not the download instructions for this private candidate.</w:t>
-      </w:r>
-    </w:p>
-    <w:bookmarkEnd w:id="21"/>
-    <w:bookmarkStart w:id="22" w:name="first-run"/>
+        <w:t xml:space="preserve">“Townlight Beta 1” identifies this coordinated beta delivery. It does not renumber the installer, native binary, Python packages or historical receipts. Component versions may differ. This edition accompanies the newly packaged and signed MSI containing the Station delivery additions. The native desktop and other native payload files retain their accepted signed bytes. Historical release pages and manuals describe their own versions and are not the download instructions for this Station delivery candidate.</w:t>
+      </w:r>
+    </w:p>
+    <w:bookmarkEnd w:id="22"/>
+    <w:bookmarkStart w:id="23" w:name="first-run"/>
     <w:p>
       <w:pPr>
         <w:pStyle w:val="Heading1"/>
@@ -780,7 +830,21 @@
         </w:numPr>
       </w:pPr>
       <w:r>
-        <w:t xml:space="preserve">Obtain the identified signed private candidate and its corresponding-source companion from the beta coordinator. The landing pages in this documentation are not an installer download service.</w:t>
+        <w:t xml:space="preserve">Download the signed Windows installer and matching source/documentation companions from the</w:t>
+      </w:r>
+      <w:r>
+        <w:t xml:space="preserve"> </w:t>
+      </w:r>
+      <w:hyperlink r:id="rId19">
+        <w:r>
+          <w:rPr>
+            <w:rStyle w:val="Hyperlink"/>
+          </w:rPr>
+          <w:t xml:space="preserve">Station delivery release</w:t>
+        </w:r>
+      </w:hyperlink>
+      <w:r>
+        <w:t xml:space="preserve">. Use that release’s checksums and publisher signature to identify the candidate.</w:t>
       </w:r>
     </w:p>
     <w:p>
@@ -912,8 +976,8 @@
         <w:t xml:space="preserve">Provision Station separately if it is part of the beta exercise. Selecting the desktop composition does not start or configure Station. Configure vision explicitly only if automatic photo drafting is selected.</w:t>
       </w:r>
     </w:p>
-    <w:bookmarkEnd w:id="22"/>
-    <w:bookmarkStart w:id="32" w:name="daily-workflow"/>
+    <w:bookmarkEnd w:id="23"/>
+    <w:bookmarkStart w:id="33" w:name="daily-workflow"/>
     <w:p>
       <w:pPr>
         <w:pStyle w:val="Heading1"/>
@@ -922,7 +986,7 @@
         <w:t xml:space="preserve">Daily workflow</w:t>
       </w:r>
     </w:p>
-    <w:bookmarkStart w:id="23" w:name="workflow-1"/>
+    <w:bookmarkStart w:id="24" w:name="workflow-1"/>
     <w:p>
       <w:pPr>
         <w:pStyle w:val="Heading2"/>
@@ -939,8 +1003,8 @@
         <w:t xml:space="preserve">Create and save the actual meeting and agenda in Meetings. Assign each selected agenda item to that meeting. A recording request cannot substitute an editable meeting label for the canonical records.</w:t>
       </w:r>
     </w:p>
-    <w:bookmarkEnd w:id="23"/>
-    <w:bookmarkStart w:id="24" w:name="workflow-2"/>
+    <w:bookmarkEnd w:id="24"/>
+    <w:bookmarkStart w:id="25" w:name="workflow-2"/>
     <w:p>
       <w:pPr>
         <w:pStyle w:val="Heading2"/>
@@ -957,8 +1021,8 @@
         <w:t xml:space="preserve">Sign in as authorized staff. Use the configured local operator command with the explicit native profile root. It obtains a short-lived one-use browser ticket; the native proof is not placed in the URL.</w:t>
       </w:r>
     </w:p>
-    <w:bookmarkEnd w:id="24"/>
-    <w:bookmarkStart w:id="25" w:name="workflow-3"/>
+    <w:bookmarkEnd w:id="25"/>
+    <w:bookmarkStart w:id="26" w:name="workflow-3"/>
     <w:p>
       <w:pPr>
         <w:pStyle w:val="Heading2"/>
@@ -975,8 +1039,8 @@
         <w:t xml:space="preserve">Select the meeting, assigned agenda and administrator-configured live-source ID. For recorded-file work, place the source in the managed ingest directory and optionally supply an SRT sidecar. Callers cannot submit arbitrary pipelines or filesystem paths.</w:t>
       </w:r>
     </w:p>
-    <w:bookmarkEnd w:id="25"/>
-    <w:bookmarkStart w:id="26" w:name="workflow-4"/>
+    <w:bookmarkEnd w:id="26"/>
+    <w:bookmarkStart w:id="27" w:name="workflow-4"/>
     <w:p>
       <w:pPr>
         <w:pStyle w:val="Heading2"/>
@@ -993,8 +1057,8 @@
         <w:t xml:space="preserve">Start capture and distinguish waiting for a signal from active recording. Stop requests pipeline drain. Wait for completed status and validated output; a partial, failed or interrupted attempt is not a completed recording.</w:t>
       </w:r>
     </w:p>
-    <w:bookmarkEnd w:id="26"/>
-    <w:bookmarkStart w:id="27" w:name="workflow-5"/>
+    <w:bookmarkEnd w:id="27"/>
+    <w:bookmarkStart w:id="28" w:name="workflow-5"/>
     <w:p>
       <w:pPr>
         <w:pStyle w:val="Heading2"/>
@@ -1011,8 +1075,8 @@
         <w:t xml:space="preserve">Inspect the media and retained context/hash. Retry is explicit for failed/interrupted recorded-file jobs. A lost live signal cannot be reconstructed: begin a new live recording and preserve the failed attempt.</w:t>
       </w:r>
     </w:p>
-    <w:bookmarkEnd w:id="27"/>
-    <w:bookmarkStart w:id="28" w:name="workflow-6"/>
+    <w:bookmarkEnd w:id="28"/>
+    <w:bookmarkStart w:id="29" w:name="workflow-6"/>
     <w:p>
       <w:pPr>
         <w:pStyle w:val="Heading2"/>
@@ -1029,8 +1093,8 @@
         <w:t xml:space="preserve">Choose an existing Records request and attach the reviewed recording. The receiver checks bytes/hash and retains a locked private original. Repeating the same handoff retains one canonical document.</w:t>
       </w:r>
     </w:p>
-    <w:bookmarkEnd w:id="28"/>
-    <w:bookmarkStart w:id="29" w:name="workflow-7"/>
+    <w:bookmarkEnd w:id="29"/>
+    <w:bookmarkStart w:id="30" w:name="workflow-7"/>
     <w:p>
       <w:pPr>
         <w:pStyle w:val="Heading2"/>
@@ -1047,8 +1111,8 @@
         <w:t xml:space="preserve">Scheduling, dry-run/commit playout, staff approval and local publication are distinct API operations. Public playback only serves the separately approved packaged output. Nothing in capture or Records handoff automatically publishes it.</w:t>
       </w:r>
     </w:p>
-    <w:bookmarkEnd w:id="29"/>
-    <w:bookmarkStart w:id="30" w:name="workflow-8"/>
+    <w:bookmarkEnd w:id="30"/>
+    <w:bookmarkStart w:id="31" w:name="workflow-8"/>
     <w:p>
       <w:pPr>
         <w:pStyle w:val="Heading2"/>
@@ -1065,8 +1129,8 @@
         <w:t xml:space="preserve">Sign out of the operator. Back up Station’s database and media evidence together, separately from Core’s native profile backup. Restart interrupted work deliberately; do not automatically re-air a lost signal.</w:t>
       </w:r>
     </w:p>
-    <w:bookmarkEnd w:id="30"/>
-    <w:bookmarkStart w:id="31" w:name="working-safely"/>
+    <w:bookmarkEnd w:id="31"/>
+    <w:bookmarkStart w:id="32" w:name="working-safely"/>
     <w:p>
       <w:pPr>
         <w:pStyle w:val="Heading2"/>
@@ -1107,9 +1171,9 @@
         <w:t xml:space="preserve">Drafting, review, approval, attachment, export, fulfillment and publication are separate operations. A Townlight workpaper does not itself adopt law, issue a permit, impose a fine or release a records response. The responsible staff member records the applicable decision.</w:t>
       </w:r>
     </w:p>
-    <w:bookmarkEnd w:id="31"/>
     <w:bookmarkEnd w:id="32"/>
-    <w:bookmarkStart w:id="34" w:name="connected-workflows"/>
+    <w:bookmarkEnd w:id="33"/>
+    <w:bookmarkStart w:id="35" w:name="connected-workflows"/>
     <w:p>
       <w:pPr>
         <w:pStyle w:val="Heading1"/>
@@ -1281,7 +1345,7 @@
         </w:tc>
       </w:tr>
     </w:tbl>
-    <w:bookmarkStart w:id="33" w:name="product-boundary"/>
+    <w:bookmarkStart w:id="34" w:name="product-boundary"/>
     <w:p>
       <w:pPr>
         <w:pStyle w:val="Heading2"/>
@@ -1298,9 +1362,9 @@
         <w:t xml:space="preserve">There is no Station first-run wizard or automatic activation by the desktop composition. The accepted normal-profile path uses an explicitly configured paired Townlight HTTP process. Physical encoder/network, remote identity, SCM commissioning, CDN delivery and long-duration field quality are not certified. Station does not perform automatic meeting speech recognition.</w:t>
       </w:r>
     </w:p>
-    <w:bookmarkEnd w:id="33"/>
     <w:bookmarkEnd w:id="34"/>
-    <w:bookmarkStart w:id="38" w:name="architecture"/>
+    <w:bookmarkEnd w:id="35"/>
+    <w:bookmarkStart w:id="39" w:name="architecture"/>
     <w:p>
       <w:pPr>
         <w:pStyle w:val="Heading1"/>
@@ -1318,18 +1382,18 @@
           <wp:inline>
             <wp:extent cx="6489700" cy="2298435"/>
             <wp:effectExtent b="0" l="0" r="0" t="0"/>
-            <wp:docPr descr="Townlight Station architecture" title="" id="36" name="Picture"/>
+            <wp:docPr descr="Townlight architecture" title="" id="37" name="Picture"/>
             <a:graphic>
               <a:graphicData uri="http://schemas.openxmlformats.org/drawingml/2006/picture">
                 <pic:pic>
                   <pic:nvPicPr>
-                    <pic:cNvPr descr="C:/Users/scott/Documents/Codex/2026-10-26/read-this-and-check-the-software/outputs/townlight-beta-1-documentation/site/assets/word/station-architecture.png" id="37" name="Picture"/>
+                    <pic:cNvPr descr="C:/Users/scott/Documents/Codex/2026-10-26/read-this-and-check-the-software/outputs/publication-2026-10-31/documentation/site/assets/word/station-architecture.png" id="38" name="Picture"/>
                     <pic:cNvPicPr>
                       <a:picLocks noChangeArrowheads="1" noChangeAspect="1"/>
                     </pic:cNvPicPr>
                   </pic:nvPicPr>
                   <pic:blipFill>
-                    <a:blip r:embed="rId35"/>
+                    <a:blip r:embed="rId36"/>
                     <a:stretch>
                       <a:fillRect/>
                     </a:stretch>
@@ -1361,7 +1425,7 @@
         <w:pStyle w:val="ImageCaption"/>
       </w:pPr>
       <w:r>
-        <w:t xml:space="preserve">Townlight Station architecture</w:t>
+        <w:t xml:space="preserve">Townlight architecture</w:t>
       </w:r>
     </w:p>
     <w:p>
@@ -1372,8 +1436,8 @@
         <w:t xml:space="preserve">The drawing shows the principal staff/evidence path. Native commands carry trusted identity to Python business services; PostgreSQL and retained original files hold durable state. A downstream copy does not silently transfer decision authority. Station has its own configured authority/media boundary, database and mutable files. The connected-workflow text supplies the drawing’s reading order and accessibility alternative.</w:t>
       </w:r>
     </w:p>
-    <w:bookmarkEnd w:id="38"/>
-    <w:bookmarkStart w:id="45" w:name="scheduling-playout-and-recovery"/>
+    <w:bookmarkEnd w:id="39"/>
+    <w:bookmarkStart w:id="46" w:name="scheduling-playout-and-recovery"/>
     <w:p>
       <w:pPr>
         <w:pStyle w:val="Heading1"/>
@@ -1382,7 +1446,7 @@
         <w:t xml:space="preserve">Scheduling playout and recovery</w:t>
       </w:r>
     </w:p>
-    <w:bookmarkStart w:id="39" w:name="Xa514834ba313e05da0a4cb4127a0c61de5dbbee"/>
+    <w:bookmarkStart w:id="40" w:name="Xa514834ba313e05da0a4cb4127a0c61de5dbbee"/>
     <w:p>
       <w:pPr>
         <w:pStyle w:val="Heading2"/>
@@ -1774,8 +1838,8 @@
         <w:t xml:space="preserve">, not replayed late. A start within that grace can dispatch on the next worker pass. Inspect the linked recording for its own queued/running/completed or failed state. Do not assume scheduling also commits that recording to air.</w:t>
       </w:r>
     </w:p>
-    <w:bookmarkEnd w:id="39"/>
-    <w:bookmarkStart w:id="40" w:name="apply-the-caption-profile"/>
+    <w:bookmarkEnd w:id="40"/>
+    <w:bookmarkStart w:id="41" w:name="apply-the-caption-profile"/>
     <w:p>
       <w:pPr>
         <w:pStyle w:val="Heading2"/>
@@ -1800,8 +1864,8 @@
         <w:t xml:space="preserve">Original files are limited to 2,147,483,647 bytes and sidecars to 5,000,000 bytes. After publication, browser playback uses the packaged MP4 and a separate WebVTT track when produced. Preserve original inputs and recorded caption provenance separately from those derivatives.</w:t>
       </w:r>
     </w:p>
-    <w:bookmarkEnd w:id="40"/>
-    <w:bookmarkStart w:id="41" w:name="check-playout-and-commit-deliberately"/>
+    <w:bookmarkEnd w:id="41"/>
+    <w:bookmarkStart w:id="42" w:name="check-playout-and-commit-deliberately"/>
     <w:p>
       <w:pPr>
         <w:pStyle w:val="Heading2"/>
@@ -2058,8 +2122,8 @@
         <w:t xml:space="preserve">until terminal. The scheduled on-air program follows verified committed output, not every dry-run or every recording. Keep the worker and air roles distinct: one renders work, the other follows durable on-air state and emits the local program.</w:t>
       </w:r>
     </w:p>
-    <w:bookmarkEnd w:id="41"/>
-    <w:bookmarkStart w:id="42" w:name="take-a-live-override-and-return"/>
+    <w:bookmarkEnd w:id="42"/>
+    <w:bookmarkStart w:id="43" w:name="take-a-live-override-and-return"/>
     <w:p>
       <w:pPr>
         <w:pStyle w:val="Heading2"/>
@@ -2183,8 +2247,8 @@
         <w:t xml:space="preserve">with no payload). Confirm the mode returns to scheduled program. The override supersedes the scheduled output; it does not delete its committed material. If no valid committed program is available, do not assume returning has produced a usable broadcast. Read actual output/state and any error. These are local synthetic on-air controls, not proof of a commissioned cable headend, physical receiver or public CDN.</w:t>
       </w:r>
     </w:p>
-    <w:bookmarkEnd w:id="42"/>
-    <w:bookmarkStart w:id="43" w:name="approve-and-publish-local-playback"/>
+    <w:bookmarkEnd w:id="43"/>
+    <w:bookmarkStart w:id="44" w:name="approve-and-publish-local-playback"/>
     <w:p>
       <w:pPr>
         <w:pStyle w:val="Heading2"/>
@@ -2316,8 +2380,8 @@
         <w:t xml:space="preserve">, capture, attachment to Records and a Records release. Internet commissioning remains outside this local procedure.</w:t>
       </w:r>
     </w:p>
-    <w:bookmarkEnd w:id="43"/>
-    <w:bookmarkStart w:id="44" w:name="recover-without-replaying-unknown-work"/>
+    <w:bookmarkEnd w:id="44"/>
+    <w:bookmarkStart w:id="45" w:name="recover-without-replaying-unknown-work"/>
     <w:p>
       <w:pPr>
         <w:pStyle w:val="Heading2"/>
@@ -2449,9 +2513,9 @@
         <w:t xml:space="preserve">service schema.</w:t>
       </w:r>
     </w:p>
-    <w:bookmarkEnd w:id="44"/>
     <w:bookmarkEnd w:id="45"/>
-    <w:bookmarkStart w:id="53" w:name="technical-specifications"/>
+    <w:bookmarkEnd w:id="46"/>
+    <w:bookmarkStart w:id="54" w:name="technical-specifications"/>
     <w:p>
       <w:pPr>
         <w:pStyle w:val="Heading1"/>
@@ -2460,7 +2524,7 @@
         <w:t xml:space="preserve">Technical specifications</w:t>
       </w:r>
     </w:p>
-    <w:bookmarkStart w:id="46" w:name="runtime-and-storage"/>
+    <w:bookmarkStart w:id="47" w:name="runtime-and-storage"/>
     <w:p>
       <w:pPr>
         <w:pStyle w:val="Heading2"/>
@@ -2624,8 +2688,8 @@
         <w:t xml:space="preserve">must be absolute. Local configuration and secrets live under that profile; protected managed files and database state must be backed up coherently. Source/runtime identity is distinct from a product’s display label.</w:t>
       </w:r>
     </w:p>
-    <w:bookmarkEnd w:id="46"/>
-    <w:bookmarkStart w:id="47" w:name="data-and-consistency"/>
+    <w:bookmarkEnd w:id="47"/>
+    <w:bookmarkStart w:id="48" w:name="data-and-consistency"/>
     <w:p>
       <w:pPr>
         <w:pStyle w:val="Heading2"/>
@@ -2650,8 +2714,8 @@
         <w:t xml:space="preserve">Versioned saves use expected prior revision identifiers where defined. Reopen and reconcile on conflict. Exact exports and handoffs use source IDs, current visibility, revision and SHA256. Review belongs to the saved revision and does not transfer silently to edited text. Database changes use the owning product’s migrations; a request or readiness check is not an authorization to mutate schema.</w:t>
       </w:r>
     </w:p>
-    <w:bookmarkEnd w:id="47"/>
-    <w:bookmarkStart w:id="50" w:name="capacity-and-platform-statements"/>
+    <w:bookmarkEnd w:id="48"/>
+    <w:bookmarkStart w:id="51" w:name="capacity-and-platform-statements"/>
     <w:p>
       <w:pPr>
         <w:pStyle w:val="Heading2"/>
@@ -2678,7 +2742,7 @@
       <w:r>
         <w:t xml:space="preserve"> </w:t>
       </w:r>
-      <w:hyperlink r:id="rId48">
+      <w:hyperlink r:id="rId49">
         <w:r>
           <w:rPr>
             <w:rStyle w:val="Hyperlink"/>
@@ -2695,7 +2759,7 @@
       <w:r>
         <w:t xml:space="preserve"> </w:t>
       </w:r>
-      <w:hyperlink r:id="rId49">
+      <w:hyperlink r:id="rId50">
         <w:r>
           <w:rPr>
             <w:rStyle w:val="Hyperlink"/>
@@ -2710,8 +2774,8 @@
         <w:t xml:space="preserve">records shipped dependency declarations. These references are more precise than a manually copied dependency list. Third-party and historical license notices must accompany their matching payloads.</w:t>
       </w:r>
     </w:p>
-    <w:bookmarkEnd w:id="50"/>
-    <w:bookmarkStart w:id="51" w:name="station-operator-and-media-components"/>
+    <w:bookmarkEnd w:id="51"/>
+    <w:bookmarkStart w:id="52" w:name="station-operator-and-media-components"/>
     <w:p>
       <w:pPr>
         <w:pStyle w:val="Heading2"/>
@@ -2832,8 +2896,8 @@
         <w:t xml:space="preserve">The separate pinned CivicCast-derived media engine uses Python/native GStreamer processing and bounded media children. It is not the standalone CivicCast application. Station’s control database, data root, service/configuration and update identity remain independent. This describes the current mixed stack; no runtime rewrite or CivicCast migration is implied.</w:t>
       </w:r>
     </w:p>
-    <w:bookmarkEnd w:id="51"/>
-    <w:bookmarkStart w:id="52" w:name="station-media-and-lifecycle-contract"/>
+    <w:bookmarkEnd w:id="52"/>
+    <w:bookmarkStart w:id="53" w:name="station-media-and-lifecycle-contract"/>
     <w:p>
       <w:pPr>
         <w:pStyle w:val="Heading2"/>
@@ -3009,9 +3073,9 @@
         <w:t xml:space="preserve">do not make content available as completed. Completion requires the worker’s clean media teardown and stream validation. Failed/interrupted file jobs may be explicitly retried; a live gap requires a new capture. Records receives verified bytes and canonical provenance as a locked private original. Local publication is an explicit later operation on separately approved playout; its MP4/WebVTT package is distinct from the retained recording and from a Records release.</w:t>
       </w:r>
     </w:p>
-    <w:bookmarkEnd w:id="52"/>
     <w:bookmarkEnd w:id="53"/>
-    <w:bookmarkStart w:id="60" w:name="configuration-and-administration"/>
+    <w:bookmarkEnd w:id="54"/>
+    <w:bookmarkStart w:id="61" w:name="configuration-and-administration"/>
     <w:p>
       <w:pPr>
         <w:pStyle w:val="Heading1"/>
@@ -3020,7 +3084,7 @@
         <w:t xml:space="preserve">Configuration and administration</w:t>
       </w:r>
     </w:p>
-    <w:bookmarkStart w:id="54" w:name="X87ac63106655e9277e6fccca21a793e034be98f"/>
+    <w:bookmarkStart w:id="55" w:name="X87ac63106655e9277e6fccca21a793e034be98f"/>
     <w:p>
       <w:pPr>
         <w:pStyle w:val="Heading2"/>
@@ -3144,8 +3208,8 @@
         <w:t xml:space="preserve">. Choose unused ports and change both configured origins together if needed. Never point these instructions at a city’s live profile or data. Use the actual installation directory if Townlight was installed elsewhere.</w:t>
       </w:r>
     </w:p>
-    <w:bookmarkEnd w:id="54"/>
-    <w:bookmarkStart w:id="55" w:name="store-the-independent-test-configuration"/>
+    <w:bookmarkEnd w:id="55"/>
+    <w:bookmarkStart w:id="56" w:name="store-the-independent-test-configuration"/>
     <w:p>
       <w:pPr>
         <w:pStyle w:val="Heading2"/>
@@ -6434,8 +6498,8 @@
         <w:t xml:space="preserve">through its standard module entry point.</w:t>
       </w:r>
     </w:p>
-    <w:bookmarkEnd w:id="55"/>
-    <w:bookmarkStart w:id="56" w:name="provision-the-station-database-once"/>
+    <w:bookmarkEnd w:id="56"/>
+    <w:bookmarkStart w:id="57" w:name="provision-the-station-database-once"/>
     <w:p>
       <w:pPr>
         <w:pStyle w:val="Heading2"/>
@@ -7053,8 +7117,8 @@
         <w:t xml:space="preserve">is explicit; API requests do not substitute for schema migration.</w:t>
       </w:r>
     </w:p>
-    <w:bookmarkEnd w:id="56"/>
-    <w:bookmarkStart w:id="57" w:name="start-and-check-the-paired-processes"/>
+    <w:bookmarkEnd w:id="57"/>
+    <w:bookmarkStart w:id="58" w:name="start-and-check-the-paired-processes"/>
     <w:p>
       <w:pPr>
         <w:pStyle w:val="Heading2"/>
@@ -9172,8 +9236,8 @@
         <w:t xml:space="preserve">directory. Back up the dedicated database and media together; Core’s native backup does not cover them.</w:t>
       </w:r>
     </w:p>
-    <w:bookmarkEnd w:id="57"/>
-    <w:bookmarkStart w:id="58" w:name="X2960807945f2e1ef0b59e5c8081d3397cfd174e"/>
+    <w:bookmarkEnd w:id="58"/>
+    <w:bookmarkStart w:id="59" w:name="X2960807945f2e1ef0b59e5c8081d3397cfd174e"/>
     <w:p>
       <w:pPr>
         <w:pStyle w:val="Heading2"/>
@@ -9493,8 +9557,8 @@
         <w:t xml:space="preserve">This normal operator command opens the operator for a future staff exercise. It reads the native session and exchanges a one-use launch ticket; it does not seed authority or put the native proof in a URL. Ticket expiry is 60 seconds, operator cookie lifetime 900 seconds, with at most 256 outstanding tickets/sessions each. Reopen normally after expiration, API restart or sign-out. Changing database/configuration identities does not repair a staff permission refusal.</w:t>
       </w:r>
     </w:p>
-    <w:bookmarkEnd w:id="58"/>
-    <w:bookmarkStart w:id="59" w:name="bounds-and-shutdown"/>
+    <w:bookmarkEnd w:id="59"/>
+    <w:bookmarkStart w:id="60" w:name="bounds-and-shutdown"/>
     <w:p>
       <w:pPr>
         <w:pStyle w:val="Heading2"/>
@@ -10318,9 +10382,9 @@
         <w:t xml:space="preserve">Retain the ownership file if the shell must close; parse and verify its actual process paths/start times before acting. Do not terminate the native database/supervisor or CivicCast. Interrupting a worker during a job preserves an interrupted attempt, not completed media; recovery is described in the Station operating procedure. Clear secret-bearing environment values when closing the dedicated deployment shell. Do not delete the database/data root to “reset” an uncertain result.</w:t>
       </w:r>
     </w:p>
-    <w:bookmarkEnd w:id="59"/>
     <w:bookmarkEnd w:id="60"/>
-    <w:bookmarkStart w:id="69" w:name="api-and-integration-examples"/>
+    <w:bookmarkEnd w:id="61"/>
+    <w:bookmarkStart w:id="70" w:name="api-and-integration-examples"/>
     <w:p>
       <w:pPr>
         <w:pStyle w:val="Heading1"/>
@@ -10329,7 +10393,7 @@
         <w:t xml:space="preserve">API and integration examples</w:t>
       </w:r>
     </w:p>
-    <w:bookmarkStart w:id="61" w:name="native-command-example"/>
+    <w:bookmarkStart w:id="62" w:name="native-command-example"/>
     <w:p>
       <w:pPr>
         <w:pStyle w:val="Heading2"/>
@@ -10594,8 +10658,8 @@
         <w:t xml:space="preserve">;</w:t>
       </w:r>
     </w:p>
-    <w:bookmarkEnd w:id="61"/>
-    <w:bookmarkStart w:id="62" w:name="trusted-local-http-example"/>
+    <w:bookmarkEnd w:id="62"/>
+    <w:bookmarkStart w:id="63" w:name="trusted-local-http-example"/>
     <w:p>
       <w:pPr>
         <w:pStyle w:val="Heading2"/>
@@ -10656,8 +10720,8 @@
         <w:t xml:space="preserve"># Authenticated recording operations additionally require current native proof.</w:t>
       </w:r>
     </w:p>
-    <w:bookmarkEnd w:id="62"/>
-    <w:bookmarkStart w:id="63" w:name="Xc1e641ed528d4025c368f165cf10eb57eaf8eef"/>
+    <w:bookmarkEnd w:id="63"/>
+    <w:bookmarkStart w:id="64" w:name="Xc1e641ed528d4025c368f165cf10eb57eaf8eef"/>
     <w:p>
       <w:pPr>
         <w:pStyle w:val="Heading2"/>
@@ -11479,8 +11543,8 @@
         <w:t xml:space="preserve">This write requires Meetings to be enabled and the signed-in staff role to permit it. It is a cross-suite integration example; for this product’s request models, use the complete technical reference below.</w:t>
       </w:r>
     </w:p>
-    <w:bookmarkEnd w:id="63"/>
-    <w:bookmarkStart w:id="64" w:name="recording-and-records-handoff-example"/>
+    <w:bookmarkEnd w:id="64"/>
+    <w:bookmarkStart w:id="65" w:name="recording-and-records-handoff-example"/>
     <w:p>
       <w:pPr>
         <w:pStyle w:val="Heading2"/>
@@ -11898,8 +11962,8 @@
         <w:t xml:space="preserve">The shown hash is deliberately a placeholder. Use the actual completed recording’s hash. A mismatched hash must fail. Repeating the identical completed handoff is idempotent; it does not create a release copy or fulfill a request.</w:t>
       </w:r>
     </w:p>
-    <w:bookmarkEnd w:id="64"/>
-    <w:bookmarkStart w:id="68" w:name="complete-technical-contract"/>
+    <w:bookmarkEnd w:id="65"/>
+    <w:bookmarkStart w:id="69" w:name="complete-technical-contract"/>
     <w:p>
       <w:pPr>
         <w:pStyle w:val="Heading2"/>
@@ -11918,7 +11982,7 @@
       <w:r>
         <w:t xml:space="preserve"> </w:t>
       </w:r>
-      <w:hyperlink r:id="rId65">
+      <w:hyperlink r:id="rId66">
         <w:r>
           <w:rPr>
             <w:rStyle w:val="Hyperlink"/>
@@ -11935,7 +11999,7 @@
       <w:r>
         <w:t xml:space="preserve"> </w:t>
       </w:r>
-      <w:hyperlink r:id="rId66">
+      <w:hyperlink r:id="rId67">
         <w:r>
           <w:rPr>
             <w:rStyle w:val="Hyperlink"/>
@@ -11952,7 +12016,7 @@
       <w:r>
         <w:t xml:space="preserve"> </w:t>
       </w:r>
-      <w:hyperlink r:id="rId67">
+      <w:hyperlink r:id="rId68">
         <w:r>
           <w:rPr>
             <w:rStyle w:val="Hyperlink"/>
@@ -11967,9 +12031,9 @@
         <w:t xml:space="preserve">includes configuration/source inventories, dependency declarations, native command contracts, MCP signatures and candidate evidence.</w:t>
       </w:r>
     </w:p>
-    <w:bookmarkEnd w:id="68"/>
     <w:bookmarkEnd w:id="69"/>
-    <w:bookmarkStart w:id="71" w:name="mcp-and-automation-boundary"/>
+    <w:bookmarkEnd w:id="70"/>
+    <w:bookmarkStart w:id="72" w:name="mcp-and-automation-boundary"/>
     <w:p>
       <w:pPr>
         <w:pStyle w:val="Heading1"/>
@@ -12177,7 +12241,7 @@
       <w:r>
         <w:t xml:space="preserve"> </w:t>
       </w:r>
-      <w:hyperlink r:id="rId70">
+      <w:hyperlink r:id="rId71">
         <w:r>
           <w:rPr>
             <w:rStyle w:val="Hyperlink"/>
@@ -12189,8 +12253,8 @@
         <w:t xml:space="preserve">. Station meeting capture does not become live speech recognition because this optional donor adapter exists.</w:t>
       </w:r>
     </w:p>
-    <w:bookmarkEnd w:id="71"/>
-    <w:bookmarkStart w:id="72" w:name="security-and-permissions"/>
+    <w:bookmarkEnd w:id="72"/>
+    <w:bookmarkStart w:id="73" w:name="security-and-permissions"/>
     <w:p>
       <w:pPr>
         <w:pStyle w:val="Heading1"/>
@@ -12247,8 +12311,8 @@
         <w:t xml:space="preserve">Use protected local folders, account permissions and credential storage. Never include the native session file, database passwords, provider keys or unredacted support bundles in a public issue or generated public documentation. A local public view is not automatically a secured internet deployment. Keep network exposure and real equipment acceptance specific to the chosen beta site.</w:t>
       </w:r>
     </w:p>
-    <w:bookmarkEnd w:id="72"/>
-    <w:bookmarkStart w:id="73" w:name="backup-recovery-and-maintenance"/>
+    <w:bookmarkEnd w:id="73"/>
+    <w:bookmarkStart w:id="74" w:name="backup-recovery-and-maintenance"/>
     <w:p>
       <w:pPr>
         <w:pStyle w:val="Heading1"/>
@@ -12376,8 +12440,8 @@
         <w:t xml:space="preserve">On failure, record the time, selected composition, component/installer versions and exact message. Check System Health for stopped, starting, ready or failed dependencies. Use the existing Retry control after readiness; do not create duplicate business records to refresh a stale view. Share only a redacted diagnostic bundle. Preserve secrets, original evidence, recovery material and unrelated installations.</w:t>
       </w:r>
     </w:p>
-    <w:bookmarkEnd w:id="73"/>
-    <w:bookmarkStart w:id="74" w:name="troubleshooting"/>
+    <w:bookmarkEnd w:id="74"/>
+    <w:bookmarkStart w:id="75" w:name="troubleshooting"/>
     <w:p>
       <w:pPr>
         <w:pStyle w:val="Heading1"/>
@@ -13221,8 +13285,8 @@
         </w:tc>
       </w:tr>
     </w:tbl>
-    <w:bookmarkEnd w:id="74"/>
-    <w:bookmarkStart w:id="77" w:name="verified-workflows-and-limits"/>
+    <w:bookmarkEnd w:id="75"/>
+    <w:bookmarkStart w:id="78" w:name="verified-workflows-and-limits"/>
     <w:p>
       <w:pPr>
         <w:pStyle w:val="Heading1"/>
@@ -13391,7 +13455,7 @@
         <w:pStyle w:val="BodyText"/>
       </w:pPr>
       <w:r>
-        <w:t xml:space="preserve">These results come from the identified signed candidate’s fresh normal-profile Sandbox exercise: real native IPC/HTTP/PostgreSQL and selected headless controls. All accounts, source bundles and media were synthetic. The guest install/uninstall and recovery passed, and the owned Sandbox stopped. No host installed application or standalone CivicCast was changed. This documentation task reuses those receipts; it does not claim a new software acceptance run.</w:t>
+        <w:t xml:space="preserve">The following baseline results come from the previously accepted signed candidate’s fresh normal-profile Sandbox exercise: real native IPC/HTTP/PostgreSQL and selected headless controls. All accounts, source bundles and media were synthetic. The guest install/uninstall and recovery passed, and the owned Sandbox stopped. No host installed application or standalone CivicCast was changed. Those baseline receipts are retained for unchanged workflows. The accompanying ACCEPTANCE.md records the separate installed verification and exact identity of this new Station delivery candidate.</w:t>
       </w:r>
     </w:p>
     <w:p>
@@ -13404,7 +13468,7 @@
       <w:r>
         <w:t xml:space="preserve"> </w:t>
       </w:r>
-      <w:hyperlink r:id="rId75">
+      <w:hyperlink r:id="rId76">
         <w:r>
           <w:rPr>
             <w:rStyle w:val="Hyperlink"/>
@@ -13421,7 +13485,7 @@
       <w:r>
         <w:t xml:space="preserve"> </w:t>
       </w:r>
-      <w:hyperlink r:id="rId76">
+      <w:hyperlink r:id="rId77">
         <w:r>
           <w:rPr>
             <w:rStyle w:val="Hyperlink"/>
@@ -13444,8 +13508,8 @@
         <w:t xml:space="preserve">The limits remain: actual city field acceptance and equipment/network commissioning; Station automatic provisioning/SCM commissioning; every UI/role combination; field recognition accuracy; and historical in-place upgrades are not certified. They are not five invented feature requirements. Fresh-install controlled beta handoff remains the accepted scope. This package makes no city-deployment, publication or general-availability claim.</w:t>
       </w:r>
     </w:p>
-    <w:bookmarkEnd w:id="77"/>
-    <w:bookmarkStart w:id="89" w:name="terms-of-service-and-license"/>
+    <w:bookmarkEnd w:id="78"/>
+    <w:bookmarkStart w:id="90" w:name="terms-of-service-and-license"/>
     <w:p>
       <w:pPr>
         <w:pStyle w:val="Heading1"/>
@@ -13454,7 +13518,7 @@
         <w:t xml:space="preserve">Terms of service and license</w:t>
       </w:r>
     </w:p>
-    <w:bookmarkStart w:id="78" w:name="scope-and-status"/>
+    <w:bookmarkStart w:id="79" w:name="scope-and-status"/>
     <w:p>
       <w:pPr>
         <w:pStyle w:val="Heading2"/>
@@ -13468,11 +13532,11 @@
         <w:pStyle w:val="FirstParagraph"/>
       </w:pPr>
       <w:r>
-        <w:t xml:space="preserve">These terms describe the Townlight Beta 1 software and this documentation package. This is a locally prepared private beta, not a hosted-service subscription, a city deployment agreement or a public release. No uptime commitment, support response time, indemnity, data-processing agreement or paid service is created by these documents. A separate signed agreement, if any, governs services it actually provides.</w:t>
-      </w:r>
-    </w:p>
-    <w:bookmarkEnd w:id="78"/>
-    <w:bookmarkStart w:id="81" w:name="software-license-and-rights"/>
+        <w:t xml:space="preserve">These terms describe the Townlight Beta 1 software and this documentation package. This is a public beta software distribution. It does not create a hosted-service subscription or a city deployment agreement. No uptime commitment, support response time, indemnity, data-processing agreement or paid service is created by these documents. A separate signed agreement, if any, governs services it actually provides.</w:t>
+      </w:r>
+    </w:p>
+    <w:bookmarkEnd w:id="79"/>
+    <w:bookmarkStart w:id="82" w:name="software-license-and-rights"/>
     <w:p>
       <w:pPr>
         <w:pStyle w:val="Heading2"/>
@@ -13512,7 +13576,7 @@
       <w:r>
         <w:t xml:space="preserve"> </w:t>
       </w:r>
-      <w:hyperlink r:id="rId79">
+      <w:hyperlink r:id="rId80">
         <w:r>
           <w:rPr>
             <w:rStyle w:val="Hyperlink"/>
@@ -13529,7 +13593,7 @@
       <w:r>
         <w:t xml:space="preserve"> </w:t>
       </w:r>
-      <w:hyperlink r:id="rId80">
+      <w:hyperlink r:id="rId81">
         <w:r>
           <w:rPr>
             <w:rStyle w:val="Hyperlink"/>
@@ -13541,8 +13605,8 @@
         <w:t xml:space="preserve">.</w:t>
       </w:r>
     </w:p>
-    <w:bookmarkEnd w:id="81"/>
-    <w:bookmarkStart w:id="82" w:name="data-ownership-and-access"/>
+    <w:bookmarkEnd w:id="82"/>
+    <w:bookmarkStart w:id="83" w:name="data-ownership-and-access"/>
     <w:p>
       <w:pPr>
         <w:pStyle w:val="Heading2"/>
@@ -13559,8 +13623,8 @@
         <w:t xml:space="preserve">Importing a document does not transfer its ownership or grant permission to publish it. The operating organization controls its accounts, access decisions, lawful source use, retention and review/release policy. Keep resident information, credentials, private notes and restricted evidence in their authorized locations. Documentation examples contain fictional data. No real city account, credential or record is required to exercise these examples in an isolated test environment.</w:t>
       </w:r>
     </w:p>
-    <w:bookmarkEnd w:id="82"/>
-    <w:bookmarkStart w:id="83" w:name="local-operation-and-external-processors"/>
+    <w:bookmarkEnd w:id="83"/>
+    <w:bookmarkStart w:id="84" w:name="local-operation-and-external-processors"/>
     <w:p>
       <w:pPr>
         <w:pStyle w:val="Heading2"/>
@@ -13577,8 +13641,8 @@
         <w:t xml:space="preserve">The accepted beta workflow is local and uses named staff accounts. Station has separate storage and credentials. Configure backup destinations and optional model/network providers deliberately. A configured external provider may receive submitted prompts, images or audio according to that configuration and provider’s terms; this documentation does not promise that every optional configuration is offline. An email outbox or local public view does not establish external delivery or an internet deployment. This static documentation site has no analytics, account collection or remote font dependency.</w:t>
       </w:r>
     </w:p>
-    <w:bookmarkEnd w:id="83"/>
-    <w:bookmarkStart w:id="84" w:name="staff-decisions-and-source-applicability"/>
+    <w:bookmarkEnd w:id="84"/>
+    <w:bookmarkStart w:id="85" w:name="staff-decisions-and-source-applicability"/>
     <w:p>
       <w:pPr>
         <w:pStyle w:val="Heading2"/>
@@ -13595,8 +13659,8 @@
         <w:t xml:space="preserve">Staff verify the jurisdiction, source currency, permissions, citations and proposed audience. Model output and generated guidance require review. No draft is automatically an official legal interpretation, zoning determination, permit approval, fee assessment, enforcement notice or records-release decision. Official permit fee authority remains with the adopted source and responsible organization; imported amounts do not become a new authoritative calculation.</w:t>
       </w:r>
     </w:p>
-    <w:bookmarkEnd w:id="84"/>
-    <w:bookmarkStart w:id="85" w:name="beta-operation-and-recovery"/>
+    <w:bookmarkEnd w:id="85"/>
+    <w:bookmarkStart w:id="86" w:name="beta-operation-and-recovery"/>
     <w:p>
       <w:pPr>
         <w:pStyle w:val="Heading2"/>
@@ -13613,8 +13677,8 @@
         <w:t xml:space="preserve">Use the identified candidate in its supported fresh-install scope. Preserve backups and original evidence. Test physical equipment and chosen network/service configuration before relying on them. The supplied acceptance describes selected synthetic workflows, not every screen, vendor, field condition or upgrade. Operators decide whether a particular deployment meets their own operational obligations.</w:t>
       </w:r>
     </w:p>
-    <w:bookmarkEnd w:id="85"/>
-    <w:bookmarkStart w:id="86" w:name="warranty-and-liability"/>
+    <w:bookmarkEnd w:id="86"/>
+    <w:bookmarkStart w:id="87" w:name="warranty-and-liability"/>
     <w:p>
       <w:pPr>
         <w:pStyle w:val="Heading2"/>
@@ -13631,8 +13695,8 @@
         <w:t xml:space="preserve">The covered software’s warranty and liability conditions are those in sections 15–17 of the supplied AGPL and any applicable separate written undertaking. This documentation creates no additional warranty or limitation beyond those terms. Third-party software is subject to its retained license notices. Nothing here removes rights that applicable law makes nonwaivable.</w:t>
       </w:r>
     </w:p>
-    <w:bookmarkEnd w:id="86"/>
-    <w:bookmarkStart w:id="87" w:name="support-and-incident-reporting"/>
+    <w:bookmarkEnd w:id="87"/>
+    <w:bookmarkStart w:id="88" w:name="support-and-incident-reporting"/>
     <w:p>
       <w:pPr>
         <w:pStyle w:val="Heading2"/>
@@ -13649,8 +13713,8 @@
         <w:t xml:space="preserve">Use the project’s existing SUPPORT and SECURITY guidance for its matching repository. Report reproducible behavior with the version, operation and redacted logs. Do not put credentials, resident records or unredacted evidence in a public issue. Coordinate sensitive reports through the channel designated in SECURITY. No new support address or service commitment is invented here.</w:t>
       </w:r>
     </w:p>
-    <w:bookmarkEnd w:id="87"/>
-    <w:bookmarkStart w:id="88" w:name="X31f05bddf6aa9d1ff47b7e67ed4759e27e0b8e9"/>
+    <w:bookmarkEnd w:id="88"/>
+    <w:bookmarkStart w:id="89" w:name="X31f05bddf6aa9d1ff47b7e67ed4759e27e0b8e9"/>
     <w:p>
       <w:pPr>
         <w:pStyle w:val="Heading2"/>
@@ -13667,9 +13731,9 @@
         <w:t xml:space="preserve">When an organization ends testing, it controls retention/export and removes access according to its policy. Uninstall may retain data; back up and inspect the selected removal options. Ending an exercise does not revoke rights already granted by AGPL. Later software/documentation versions must identify their changed candidate and scope; historical receipts retain their original identities. These terms do not claim that a city has accepted a contract merely by reading a manual.</w:t>
       </w:r>
     </w:p>
-    <w:bookmarkEnd w:id="88"/>
     <w:bookmarkEnd w:id="89"/>
-    <w:bookmarkStart w:id="90" w:name="glossary"/>
+    <w:bookmarkEnd w:id="90"/>
+    <w:bookmarkStart w:id="91" w:name="glossary"/>
     <w:p>
       <w:pPr>
         <w:pStyle w:val="Heading1"/>
@@ -14385,8 +14449,8 @@
         </w:tc>
       </w:tr>
     </w:tbl>
-    <w:bookmarkEnd w:id="90"/>
-    <w:bookmarkStart w:id="92" w:name="alphabetical-subject-index"/>
+    <w:bookmarkEnd w:id="91"/>
+    <w:bookmarkStart w:id="93" w:name="alphabetical-subject-index"/>
     <w:p>
       <w:pPr>
         <w:pStyle w:val="Heading1"/>
@@ -15043,7 +15107,7 @@
         <w:t xml:space="preserve">.</w:t>
       </w:r>
     </w:p>
-    <w:bookmarkStart w:id="91" w:name="operating-subject-links"/>
+    <w:bookmarkStart w:id="92" w:name="operating-subject-links"/>
     <w:p>
       <w:pPr>
         <w:pStyle w:val="Heading2"/>
@@ -15520,9 +15584,9 @@
         <w:t xml:space="preserve">.</w:t>
       </w:r>
     </w:p>
-    <w:bookmarkEnd w:id="91"/>
     <w:bookmarkEnd w:id="92"/>
-    <w:bookmarkStart w:id="97" w:name="source-and-document-control"/>
+    <w:bookmarkEnd w:id="93"/>
+    <w:bookmarkStart w:id="98" w:name="source-and-document-control"/>
     <w:p>
       <w:pPr>
         <w:pStyle w:val="Heading1"/>
@@ -15536,10 +15600,10 @@
         <w:pStyle w:val="FirstParagraph"/>
       </w:pPr>
       <w:r>
-        <w:t xml:space="preserve">This edition is authored from the immutable corresponding-source companion, the generated installed-domain schema and the retained workflow receipts. The current software versions and signed artifacts are unchanged. Public historical pages are not synchronized or published by this local documentation task.</w:t>
-      </w:r>
-    </w:p>
-    <w:bookmarkStart w:id="96" w:name="workflow-subject-index"/>
+        <w:t xml:space="preserve">This edition is authored from the immutable corresponding-source companion, the generated installed-domain schema and the retained workflow receipts. Component version numbers are retained. The private MSI has its own new hash and signing receipt. Historical release tags and their artifacts remain unchanged.</w:t>
+      </w:r>
+    </w:p>
+    <w:bookmarkStart w:id="97" w:name="workflow-subject-index"/>
     <w:p>
       <w:pPr>
         <w:pStyle w:val="Heading2"/>
@@ -15835,7 +15899,7 @@
           <w:numId w:val="1004"/>
         </w:numPr>
       </w:pPr>
-      <w:hyperlink r:id="rId93">
+      <w:hyperlink r:id="rId94">
         <w:r>
           <w:rPr>
             <w:rStyle w:val="Hyperlink"/>
@@ -15851,7 +15915,7 @@
           <w:numId w:val="1004"/>
         </w:numPr>
       </w:pPr>
-      <w:hyperlink r:id="rId49">
+      <w:hyperlink r:id="rId50">
         <w:r>
           <w:rPr>
             <w:rStyle w:val="Hyperlink"/>
@@ -15867,7 +15931,7 @@
           <w:numId w:val="1004"/>
         </w:numPr>
       </w:pPr>
-      <w:hyperlink r:id="rId94">
+      <w:hyperlink r:id="rId95">
         <w:r>
           <w:rPr>
             <w:rStyle w:val="Hyperlink"/>
@@ -15883,7 +15947,7 @@
           <w:numId w:val="1004"/>
         </w:numPr>
       </w:pPr>
-      <w:hyperlink r:id="rId75">
+      <w:hyperlink r:id="rId76">
         <w:r>
           <w:rPr>
             <w:rStyle w:val="Hyperlink"/>
@@ -15899,7 +15963,7 @@
           <w:numId w:val="1004"/>
         </w:numPr>
       </w:pPr>
-      <w:hyperlink r:id="rId95">
+      <w:hyperlink r:id="rId96">
         <w:r>
           <w:rPr>
             <w:rStyle w:val="Hyperlink"/>
@@ -15908,8 +15972,2759 @@
         </w:r>
       </w:hyperlink>
     </w:p>
-    <w:bookmarkEnd w:id="96"/>
     <w:bookmarkEnd w:id="97"/>
+    <w:bookmarkEnd w:id="98"/>
+    <w:bookmarkStart w:id="108" w:name="X181e55796f60842f5722441cc567a4aa9d88047"/>
+    <w:p>
+      <w:pPr>
+        <w:pStyle w:val="Heading1"/>
+      </w:pPr>
+      <w:r>
+        <w:t xml:space="preserve">Completed recordings on YouTube and live CivicCast coverage</w:t>
+      </w:r>
+    </w:p>
+    <w:p>
+      <w:pPr>
+        <w:pStyle w:val="FirstParagraph"/>
+      </w:pPr>
+      <w:r>
+        <w:t xml:space="preserve">This source extension adds only completed-recording YouTube uploads and a live</w:t>
+      </w:r>
+      <w:r>
+        <w:t xml:space="preserve"> </w:t>
+      </w:r>
+      <w:r>
+        <w:t xml:space="preserve">Station-to-CivicCast feed. It is</w:t>
+      </w:r>
+      <w:r>
+        <w:t xml:space="preserve"> </w:t>
+      </w:r>
+      <w:r>
+        <w:rPr>
+          <w:b/>
+          <w:bCs/>
+        </w:rPr>
+        <w:t xml:space="preserve">not in the published Beta 1 installer</w:t>
+      </w:r>
+      <w:r>
+        <w:t xml:space="preserve">. Existing</w:t>
+      </w:r>
+      <w:r>
+        <w:t xml:space="preserve"> </w:t>
+      </w:r>
+      <w:r>
+        <w:t xml:space="preserve">component versions are retained. New Station code is AGPL-3.0-only. The pinned</w:t>
+      </w:r>
+      <w:r>
+        <w:t xml:space="preserve"> </w:t>
+      </w:r>
+      <w:r>
+        <w:t xml:space="preserve">CivicCast source and third-party licenses remain unchanged. Standalone CivicCast</w:t>
+      </w:r>
+      <w:r>
+        <w:t xml:space="preserve"> </w:t>
+      </w:r>
+      <w:r>
+        <w:t xml:space="preserve">is a separate product; no installer, account, database, service or default in it</w:t>
+      </w:r>
+      <w:r>
+        <w:t xml:space="preserve"> </w:t>
+      </w:r>
+      <w:r>
+        <w:t xml:space="preserve">is changed by Station.</w:t>
+      </w:r>
+    </w:p>
+    <w:bookmarkStart w:id="99" w:name="staff-workflow"/>
+    <w:p>
+      <w:pPr>
+        <w:pStyle w:val="Heading2"/>
+      </w:pPr>
+      <w:r>
+        <w:t xml:space="preserve">Staff workflow</w:t>
+      </w:r>
+    </w:p>
+    <w:p>
+      <w:pPr>
+        <w:pStyle w:val="FirstParagraph"/>
+      </w:pPr>
+      <w:r>
+        <w:t xml:space="preserve">For live coverage, choose a meeting, its chamber input and the administrator’s</w:t>
+      </w:r>
+      <w:r>
+        <w:t xml:space="preserve"> </w:t>
+      </w:r>
+      <w:r>
+        <w:rPr>
+          <w:b/>
+          <w:bCs/>
+        </w:rPr>
+        <w:t xml:space="preserve">CivicCast live feed</w:t>
+      </w:r>
+      <w:r>
+        <w:t xml:space="preserve"> </w:t>
+      </w:r>
+      <w:r>
+        <w:t xml:space="preserve">option, then start recording. Choose</w:t>
+      </w:r>
+      <w:r>
+        <w:t xml:space="preserve"> </w:t>
+      </w:r>
+      <w:r>
+        <w:rPr>
+          <w:b/>
+          <w:bCs/>
+        </w:rPr>
+        <w:t xml:space="preserve">Recording only</w:t>
+      </w:r>
+      <w:r>
+        <w:t xml:space="preserve"> </w:t>
+      </w:r>
+      <w:r>
+        <w:t xml:space="preserve">to capture privately without a network feed. A disconnected receiver does not</w:t>
+      </w:r>
+      <w:r>
+        <w:t xml:space="preserve"> </w:t>
+      </w:r>
+      <w:r>
+        <w:t xml:space="preserve">stop the recording. Station sends the live MPEG-TS bytes as the recording grows;</w:t>
+      </w:r>
+      <w:r>
+        <w:t xml:space="preserve"> </w:t>
+      </w:r>
+      <w:r>
+        <w:t xml:space="preserve">it does not wait for the completed file. The feed is available only during that</w:t>
+      </w:r>
+      <w:r>
+        <w:t xml:space="preserve"> </w:t>
+      </w:r>
+      <w:r>
+        <w:t xml:space="preserve">capture. The CivicCast/PEG operator selects that source and controls when it is</w:t>
+      </w:r>
+      <w:r>
+        <w:t xml:space="preserve"> </w:t>
+      </w:r>
+      <w:r>
+        <w:t xml:space="preserve">broadcast on local cable. Station does not automatically put the PEG channel on</w:t>
+      </w:r>
+      <w:r>
+        <w:t xml:space="preserve"> </w:t>
+      </w:r>
+      <w:r>
+        <w:t xml:space="preserve">air.</w:t>
+      </w:r>
+      <w:r>
+        <w:t xml:space="preserve"> </w:t>
+      </w:r>
+      <w:r>
+        <w:rPr>
+          <w:rStyle w:val="VerbatimChar"/>
+        </w:rPr>
+        <w:t xml:space="preserve">sending</w:t>
+      </w:r>
+      <w:r>
+        <w:t xml:space="preserve"> </w:t>
+      </w:r>
+      <w:r>
+        <w:t xml:space="preserve">means transport bytes were sent, not proof of cable carriage.</w:t>
+      </w:r>
+    </w:p>
+    <w:p>
+      <w:pPr>
+        <w:pStyle w:val="BodyText"/>
+      </w:pPr>
+      <w:r>
+        <w:t xml:space="preserve">After Station shows</w:t>
+      </w:r>
+      <w:r>
+        <w:t xml:space="preserve"> </w:t>
+      </w:r>
+      <w:r>
+        <w:rPr>
+          <w:b/>
+          <w:bCs/>
+        </w:rPr>
+        <w:t xml:space="preserve">complete</w:t>
+      </w:r>
+      <w:r>
+        <w:t xml:space="preserve">, use</w:t>
+      </w:r>
+      <w:r>
+        <w:t xml:space="preserve"> </w:t>
+      </w:r>
+      <w:r>
+        <w:rPr>
+          <w:b/>
+          <w:bCs/>
+        </w:rPr>
+        <w:t xml:space="preserve">Upload completed recording to YouTube</w:t>
+      </w:r>
+      <w:r>
+        <w:t xml:space="preserve">.</w:t>
+      </w:r>
+      <w:r>
+        <w:t xml:space="preserve"> </w:t>
+      </w:r>
+      <w:r>
+        <w:t xml:space="preserve">Review the title, select private/unlisted/public visibility (default</w:t>
+      </w:r>
+      <w:r>
+        <w:t xml:space="preserve"> </w:t>
+      </w:r>
+      <w:r>
+        <w:rPr>
+          <w:b/>
+          <w:bCs/>
+        </w:rPr>
+        <w:t xml:space="preserve">private</w:t>
+      </w:r>
+      <w:r>
+        <w:t xml:space="preserve">),</w:t>
+      </w:r>
+      <w:r>
+        <w:t xml:space="preserve"> </w:t>
+      </w:r>
+      <w:r>
+        <w:t xml:space="preserve">and enter the approval note. Click</w:t>
+      </w:r>
+      <w:r>
+        <w:t xml:space="preserve"> </w:t>
+      </w:r>
+      <w:r>
+        <w:rPr>
+          <w:b/>
+          <w:bCs/>
+        </w:rPr>
+        <w:t xml:space="preserve">Upload to YouTube</w:t>
+      </w:r>
+      <w:r>
+        <w:t xml:space="preserve">. This is an explicit</w:t>
+      </w:r>
+      <w:r>
+        <w:t xml:space="preserve"> </w:t>
+      </w:r>
+      <w:r>
+        <w:t xml:space="preserve">external upload to the Station-configured OAuth account. No upload occurs just</w:t>
+      </w:r>
+      <w:r>
+        <w:t xml:space="preserve"> </w:t>
+      </w:r>
+      <w:r>
+        <w:t xml:space="preserve">because recording stopped, a playout was committed or a Records attachment was</w:t>
+      </w:r>
+      <w:r>
+        <w:t xml:space="preserve"> </w:t>
+      </w:r>
+      <w:r>
+        <w:t xml:space="preserve">made. Station does not create a YouTube livestream.</w:t>
+      </w:r>
+    </w:p>
+    <w:p>
+      <w:pPr>
+        <w:pStyle w:val="BodyText"/>
+      </w:pPr>
+      <w:r>
+        <w:t xml:space="preserve">The upload receipt shows queued/running/uploaded/failed/needs-reconciliation,</w:t>
+      </w:r>
+      <w:r>
+        <w:t xml:space="preserve"> </w:t>
+      </w:r>
+      <w:r>
+        <w:t xml:space="preserve">the chosen visibility and returned video link.</w:t>
+      </w:r>
+      <w:r>
+        <w:t xml:space="preserve"> </w:t>
+      </w:r>
+      <w:r>
+        <w:rPr>
+          <w:rStyle w:val="VerbatimChar"/>
+        </w:rPr>
+        <w:t xml:space="preserve">uploaded</w:t>
+      </w:r>
+      <w:r>
+        <w:t xml:space="preserve"> </w:t>
+      </w:r>
+      <w:r>
+        <w:t xml:space="preserve">is the YouTube upload</w:t>
+      </w:r>
+      <w:r>
+        <w:t xml:space="preserve"> </w:t>
+      </w:r>
+      <w:r>
+        <w:t xml:space="preserve">acknowledgement; YouTube may still be processing the video. The canonical</w:t>
+      </w:r>
+      <w:r>
+        <w:t xml:space="preserve"> </w:t>
+      </w:r>
+      <w:r>
+        <w:t xml:space="preserve">recording remains private and byte-identical for the existing Records handoff.</w:t>
+      </w:r>
+      <w:r>
+        <w:t xml:space="preserve"> </w:t>
+      </w:r>
+      <w:r>
+        <w:t xml:space="preserve">The YouTube visibility is separate from local playback/disclosure approval.</w:t>
+      </w:r>
+    </w:p>
+    <w:bookmarkEnd w:id="99"/>
+    <w:bookmarkStart w:id="103" w:name="architecture-1"/>
+    <w:p>
+      <w:pPr>
+        <w:pStyle w:val="Heading2"/>
+      </w:pPr>
+      <w:r>
+        <w:t xml:space="preserve">Architecture</w:t>
+      </w:r>
+    </w:p>
+    <w:p>
+      <w:pPr>
+        <w:pStyle w:val="CaptionedFigure"/>
+      </w:pPr>
+      <w:r>
+        <w:drawing>
+          <wp:inline>
+            <wp:extent cx="6489700" cy="3177248"/>
+            <wp:effectExtent b="0" l="0" r="0" t="0"/>
+            <wp:docPr descr="Townlight architecture" title="" id="101" name="Picture"/>
+            <a:graphic>
+              <a:graphicData uri="http://schemas.openxmlformats.org/drawingml/2006/picture">
+                <pic:pic>
+                  <pic:nvPicPr>
+                    <pic:cNvPr descr="C:/Users/scott/Documents/Codex/2026-10-26/read-this-and-check-the-software/outputs/publication-2026-10-31/documentation/site/assets/word/station-delivery-architecture.png" id="102" name="Picture"/>
+                    <pic:cNvPicPr>
+                      <a:picLocks noChangeArrowheads="1" noChangeAspect="1"/>
+                    </pic:cNvPicPr>
+                  </pic:nvPicPr>
+                  <pic:blipFill>
+                    <a:blip r:embed="rId100"/>
+                    <a:stretch>
+                      <a:fillRect/>
+                    </a:stretch>
+                  </pic:blipFill>
+                  <pic:spPr bwMode="auto">
+                    <a:xfrm>
+                      <a:off x="0" y="0"/>
+                      <a:ext cx="6489700" cy="3177248"/>
+                    </a:xfrm>
+                    <a:prstGeom prst="rect">
+                      <a:avLst/>
+                    </a:prstGeom>
+                    <a:noFill/>
+                    <a:ln w="9525">
+                      <a:noFill/>
+                      <a:headEnd/>
+                      <a:tailEnd/>
+                    </a:ln>
+                  </pic:spPr>
+                </pic:pic>
+              </a:graphicData>
+            </a:graphic>
+          </wp:inline>
+        </w:drawing>
+      </w:r>
+    </w:p>
+    <w:p>
+      <w:pPr>
+        <w:pStyle w:val="ImageCaption"/>
+      </w:pPr>
+      <w:r>
+        <w:t xml:space="preserve">Townlight architecture</w:t>
+      </w:r>
+    </w:p>
+    <w:p>
+      <w:pPr>
+        <w:pStyle w:val="BodyText"/>
+      </w:pPr>
+      <w:r>
+        <w:t xml:space="preserve">The sender has bounded, leaky buffers and follows the live edge after congestion.</w:t>
+      </w:r>
+      <w:r>
+        <w:t xml:space="preserve"> </w:t>
+      </w:r>
+      <w:r>
+        <w:t xml:space="preserve">Its network sink shares no pipeline with the recorder. A late join or connection</w:t>
+      </w:r>
+      <w:r>
+        <w:t xml:space="preserve"> </w:t>
+      </w:r>
+      <w:r>
+        <w:t xml:space="preserve">loss can leave a live coverage gap, while the private recording continues.</w:t>
+      </w:r>
+      <w:r>
+        <w:t xml:space="preserve"> </w:t>
+      </w:r>
+      <w:r>
+        <w:t xml:space="preserve">H.264/AAC and existing MPEG-TS captions are forwarded without another encode.</w:t>
+      </w:r>
+      <w:r>
+        <w:t xml:space="preserve"> </w:t>
+      </w:r>
+      <w:r>
+        <w:t xml:space="preserve">The MP4 upload remux reuses</w:t>
+      </w:r>
+      <w:r>
+        <w:t xml:space="preserve"> </w:t>
+      </w:r>
+      <w:r>
+        <w:rPr>
+          <w:rStyle w:val="VerbatimChar"/>
+        </w:rPr>
+        <w:t xml:space="preserve">vod_job.py</w:t>
+      </w:r>
+      <w:r>
+        <w:t xml:space="preserve">; it does not generate transcripts or</w:t>
+      </w:r>
+      <w:r>
+        <w:t xml:space="preserve"> </w:t>
+      </w:r>
+      <w:r>
+        <w:t xml:space="preserve">captions, and does not upload a separate caption track. Upload queue work runs</w:t>
+      </w:r>
+      <w:r>
+        <w:t xml:space="preserve"> </w:t>
+      </w:r>
+      <w:r>
+        <w:t xml:space="preserve">in a separate process so a long upload never monopolizes the capture worker.</w:t>
+      </w:r>
+    </w:p>
+    <w:bookmarkEnd w:id="103"/>
+    <w:bookmarkStart w:id="104" w:name="administrator-setup"/>
+    <w:p>
+      <w:pPr>
+        <w:pStyle w:val="Heading2"/>
+      </w:pPr>
+      <w:r>
+        <w:t xml:space="preserve">Administrator setup</w:t>
+      </w:r>
+    </w:p>
+    <w:p>
+      <w:pPr>
+        <w:pStyle w:val="FirstParagraph"/>
+      </w:pPr>
+      <w:r>
+        <w:t xml:space="preserve">Use Station’s existing dedicated data root and PostgreSQL database. Stop Station</w:t>
+      </w:r>
+      <w:r>
+        <w:t xml:space="preserve"> </w:t>
+      </w:r>
+      <w:r>
+        <w:t xml:space="preserve">writers for a coordinated backup, retain that backup, and run the explicit</w:t>
+      </w:r>
+      <w:r>
+        <w:t xml:space="preserve"> </w:t>
+      </w:r>
+      <w:r>
+        <w:rPr>
+          <w:rStyle w:val="VerbatimChar"/>
+        </w:rPr>
+        <w:t xml:space="preserve">townlight-station migrate</w:t>
+      </w:r>
+      <w:r>
+        <w:t xml:space="preserve"> </w:t>
+      </w:r>
+      <w:r>
+        <w:t xml:space="preserve">before starting this source version. Schema</w:t>
+      </w:r>
+      <w:r>
+        <w:t xml:space="preserve"> </w:t>
+      </w:r>
+      <w:r>
+        <w:rPr>
+          <w:b/>
+          <w:bCs/>
+        </w:rPr>
+        <w:t xml:space="preserve">4</w:t>
+      </w:r>
+      <w:r>
+        <w:t xml:space="preserve"> </w:t>
+      </w:r>
+      <w:r>
+        <w:t xml:space="preserve">adds</w:t>
+      </w:r>
+      <w:r>
+        <w:t xml:space="preserve"> </w:t>
+      </w:r>
+      <w:r>
+        <w:rPr>
+          <w:rStyle w:val="VerbatimChar"/>
+        </w:rPr>
+        <w:t xml:space="preserve">station.youtube_uploads</w:t>
+      </w:r>
+      <w:r>
+        <w:t xml:space="preserve">, keeping existing recording/schedule/playout evidence.</w:t>
+      </w:r>
+      <w:r>
+        <w:t xml:space="preserve"> </w:t>
+      </w:r>
+      <w:r>
+        <w:t xml:space="preserve">The data identity marker and component versions are unchanged. Old services</w:t>
+      </w:r>
+      <w:r>
+        <w:t xml:space="preserve"> </w:t>
+      </w:r>
+      <w:r>
+        <w:t xml:space="preserve">expect schema 3; use a matched source/runtime and preserve the backup for rollback.</w:t>
+      </w:r>
+    </w:p>
+    <w:p>
+      <w:pPr>
+        <w:pStyle w:val="BodyText"/>
+      </w:pPr>
+      <w:r>
+        <w:t xml:space="preserve">Create</w:t>
+      </w:r>
+      <w:r>
+        <w:t xml:space="preserve"> </w:t>
+      </w:r>
+      <w:r>
+        <w:rPr>
+          <w:rStyle w:val="VerbatimChar"/>
+        </w:rPr>
+        <w:t xml:space="preserve">civiccast-feeds.json</w:t>
+      </w:r>
+      <w:r>
+        <w:t xml:space="preserve"> </w:t>
+      </w:r>
+      <w:r>
+        <w:t xml:space="preserve">in the private Station data directory:</w:t>
+      </w:r>
+    </w:p>
+    <w:p>
+      <w:pPr>
+        <w:pStyle w:val="SourceCode"/>
+      </w:pPr>
+      <w:r>
+        <w:rPr>
+          <w:rStyle w:val="OtherTok"/>
+        </w:rPr>
+        <w:t xml:space="preserve">[</w:t>
+      </w:r>
+      <w:r>
+        <w:br/>
+      </w:r>
+      <w:r>
+        <w:rPr>
+          <w:rStyle w:val="NormalTok"/>
+        </w:rPr>
+        <w:t xml:space="preserve">  </w:t>
+      </w:r>
+      <w:r>
+        <w:rPr>
+          <w:rStyle w:val="FunctionTok"/>
+        </w:rPr>
+        <w:t xml:space="preserve">{</w:t>
+      </w:r>
+      <w:r>
+        <w:br/>
+      </w:r>
+      <w:r>
+        <w:rPr>
+          <w:rStyle w:val="NormalTok"/>
+        </w:rPr>
+        <w:t xml:space="preserve">    </w:t>
+      </w:r>
+      <w:r>
+        <w:rPr>
+          <w:rStyle w:val="DataTypeTok"/>
+        </w:rPr>
+        <w:t xml:space="preserve">"id"</w:t>
+      </w:r>
+      <w:r>
+        <w:rPr>
+          <w:rStyle w:val="FunctionTok"/>
+        </w:rPr>
+        <w:t xml:space="preserve">:</w:t>
+      </w:r>
+      <w:r>
+        <w:rPr>
+          <w:rStyle w:val="NormalTok"/>
+        </w:rPr>
+        <w:t xml:space="preserve"> </w:t>
+      </w:r>
+      <w:r>
+        <w:rPr>
+          <w:rStyle w:val="StringTok"/>
+        </w:rPr>
+        <w:t xml:space="preserve">"peg"</w:t>
+      </w:r>
+      <w:r>
+        <w:rPr>
+          <w:rStyle w:val="FunctionTok"/>
+        </w:rPr>
+        <w:t xml:space="preserve">,</w:t>
+      </w:r>
+      <w:r>
+        <w:br/>
+      </w:r>
+      <w:r>
+        <w:rPr>
+          <w:rStyle w:val="NormalTok"/>
+        </w:rPr>
+        <w:t xml:space="preserve">    </w:t>
+      </w:r>
+      <w:r>
+        <w:rPr>
+          <w:rStyle w:val="DataTypeTok"/>
+        </w:rPr>
+        <w:t xml:space="preserve">"label"</w:t>
+      </w:r>
+      <w:r>
+        <w:rPr>
+          <w:rStyle w:val="FunctionTok"/>
+        </w:rPr>
+        <w:t xml:space="preserve">:</w:t>
+      </w:r>
+      <w:r>
+        <w:rPr>
+          <w:rStyle w:val="NormalTok"/>
+        </w:rPr>
+        <w:t xml:space="preserve"> </w:t>
+      </w:r>
+      <w:r>
+        <w:rPr>
+          <w:rStyle w:val="StringTok"/>
+        </w:rPr>
+        <w:t xml:space="preserve">"CivicCast council feed"</w:t>
+      </w:r>
+      <w:r>
+        <w:rPr>
+          <w:rStyle w:val="FunctionTok"/>
+        </w:rPr>
+        <w:t xml:space="preserve">,</w:t>
+      </w:r>
+      <w:r>
+        <w:br/>
+      </w:r>
+      <w:r>
+        <w:rPr>
+          <w:rStyle w:val="NormalTok"/>
+        </w:rPr>
+        <w:t xml:space="preserve">    </w:t>
+      </w:r>
+      <w:r>
+        <w:rPr>
+          <w:rStyle w:val="DataTypeTok"/>
+        </w:rPr>
+        <w:t xml:space="preserve">"address"</w:t>
+      </w:r>
+      <w:r>
+        <w:rPr>
+          <w:rStyle w:val="FunctionTok"/>
+        </w:rPr>
+        <w:t xml:space="preserve">:</w:t>
+      </w:r>
+      <w:r>
+        <w:rPr>
+          <w:rStyle w:val="NormalTok"/>
+        </w:rPr>
+        <w:t xml:space="preserve"> </w:t>
+      </w:r>
+      <w:r>
+        <w:rPr>
+          <w:rStyle w:val="StringTok"/>
+        </w:rPr>
+        <w:t xml:space="preserve">"192.0.2.10"</w:t>
+      </w:r>
+      <w:r>
+        <w:rPr>
+          <w:rStyle w:val="FunctionTok"/>
+        </w:rPr>
+        <w:t xml:space="preserve">,</w:t>
+      </w:r>
+      <w:r>
+        <w:br/>
+      </w:r>
+      <w:r>
+        <w:rPr>
+          <w:rStyle w:val="NormalTok"/>
+        </w:rPr>
+        <w:t xml:space="preserve">    </w:t>
+      </w:r>
+      <w:r>
+        <w:rPr>
+          <w:rStyle w:val="DataTypeTok"/>
+        </w:rPr>
+        <w:t xml:space="preserve">"port"</w:t>
+      </w:r>
+      <w:r>
+        <w:rPr>
+          <w:rStyle w:val="FunctionTok"/>
+        </w:rPr>
+        <w:t xml:space="preserve">:</w:t>
+      </w:r>
+      <w:r>
+        <w:rPr>
+          <w:rStyle w:val="NormalTok"/>
+        </w:rPr>
+        <w:t xml:space="preserve"> </w:t>
+      </w:r>
+      <w:r>
+        <w:rPr>
+          <w:rStyle w:val="DecValTok"/>
+        </w:rPr>
+        <w:t xml:space="preserve">10080</w:t>
+      </w:r>
+      <w:r>
+        <w:rPr>
+          <w:rStyle w:val="FunctionTok"/>
+        </w:rPr>
+        <w:t xml:space="preserve">,</w:t>
+      </w:r>
+      <w:r>
+        <w:br/>
+      </w:r>
+      <w:r>
+        <w:rPr>
+          <w:rStyle w:val="NormalTok"/>
+        </w:rPr>
+        <w:t xml:space="preserve">    </w:t>
+      </w:r>
+      <w:r>
+        <w:rPr>
+          <w:rStyle w:val="DataTypeTok"/>
+        </w:rPr>
+        <w:t xml:space="preserve">"secret_env"</w:t>
+      </w:r>
+      <w:r>
+        <w:rPr>
+          <w:rStyle w:val="FunctionTok"/>
+        </w:rPr>
+        <w:t xml:space="preserve">:</w:t>
+      </w:r>
+      <w:r>
+        <w:rPr>
+          <w:rStyle w:val="NormalTok"/>
+        </w:rPr>
+        <w:t xml:space="preserve"> </w:t>
+      </w:r>
+      <w:r>
+        <w:rPr>
+          <w:rStyle w:val="StringTok"/>
+        </w:rPr>
+        <w:t xml:space="preserve">"TOWNLIGHT_STATION_SRT_PEG"</w:t>
+      </w:r>
+      <w:r>
+        <w:br/>
+      </w:r>
+      <w:r>
+        <w:rPr>
+          <w:rStyle w:val="NormalTok"/>
+        </w:rPr>
+        <w:t xml:space="preserve">  </w:t>
+      </w:r>
+      <w:r>
+        <w:rPr>
+          <w:rStyle w:val="FunctionTok"/>
+        </w:rPr>
+        <w:t xml:space="preserve">}</w:t>
+      </w:r>
+      <w:r>
+        <w:br/>
+      </w:r>
+      <w:r>
+        <w:rPr>
+          <w:rStyle w:val="OtherTok"/>
+        </w:rPr>
+        <w:t xml:space="preserve">]</w:t>
+      </w:r>
+    </w:p>
+    <w:p>
+      <w:pPr>
+        <w:pStyle w:val="FirstParagraph"/>
+      </w:pPr>
+      <w:r>
+        <w:t xml:space="preserve">The address is a numeric IPv4</w:t>
+      </w:r>
+      <w:r>
+        <w:t xml:space="preserve"> </w:t>
+      </w:r>
+      <w:r>
+        <w:rPr>
+          <w:b/>
+          <w:bCs/>
+        </w:rPr>
+        <w:t xml:space="preserve">local interface bind address on Station</w:t>
+      </w:r>
+      <w:r>
+        <w:t xml:space="preserve">, not the</w:t>
+      </w:r>
+      <w:r>
+        <w:t xml:space="preserve"> </w:t>
+      </w:r>
+      <w:r>
+        <w:t xml:space="preserve">CivicCast computer.</w:t>
+      </w:r>
+      <w:r>
+        <w:t xml:space="preserve"> </w:t>
+      </w:r>
+      <w:r>
+        <w:rPr>
+          <w:rStyle w:val="VerbatimChar"/>
+        </w:rPr>
+        <w:t xml:space="preserve">192.0.2.10</w:t>
+      </w:r>
+      <w:r>
+        <w:t xml:space="preserve"> </w:t>
+      </w:r>
+      <w:r>
+        <w:t xml:space="preserve">is a documentation placeholder. Use the actual</w:t>
+      </w:r>
+      <w:r>
+        <w:t xml:space="preserve"> </w:t>
+      </w:r>
+      <w:r>
+        <w:t xml:space="preserve">Station interface, an unused port (1024–65535), and appropriate network access</w:t>
+      </w:r>
+      <w:r>
+        <w:t xml:space="preserve"> </w:t>
+      </w:r>
+      <w:r>
+        <w:t xml:space="preserve">between those two systems. Clients select an administrator-defined ID, never an</w:t>
+      </w:r>
+      <w:r>
+        <w:t xml:space="preserve"> </w:t>
+      </w:r>
+      <w:r>
+        <w:t xml:space="preserve">arbitrary destination or media pipeline. Keep configuration files private.</w:t>
+      </w:r>
+    </w:p>
+    <w:p>
+      <w:pPr>
+        <w:pStyle w:val="BodyText"/>
+      </w:pPr>
+      <w:r>
+        <w:t xml:space="preserve">Set</w:t>
+      </w:r>
+      <w:r>
+        <w:t xml:space="preserve"> </w:t>
+      </w:r>
+      <w:r>
+        <w:rPr>
+          <w:rStyle w:val="VerbatimChar"/>
+        </w:rPr>
+        <w:t xml:space="preserve">TOWNLIGHT_STATION_SRT_PEG</w:t>
+      </w:r>
+      <w:r>
+        <w:t xml:space="preserve"> </w:t>
+      </w:r>
+      <w:r>
+        <w:t xml:space="preserve">in the capture worker’s process environment to a</w:t>
+      </w:r>
+      <w:r>
+        <w:t xml:space="preserve"> </w:t>
+      </w:r>
+      <w:r>
+        <w:t xml:space="preserve">10–79 character SRT passphrase. Configure a separate CivicCast SRT live source</w:t>
+      </w:r>
+      <w:r>
+        <w:t xml:space="preserve"> </w:t>
+      </w:r>
+      <w:r>
+        <w:t xml:space="preserve">with the caller URI</w:t>
+      </w:r>
+      <w:r>
+        <w:t xml:space="preserve"> </w:t>
+      </w:r>
+      <w:r>
+        <w:rPr>
+          <w:rStyle w:val="VerbatimChar"/>
+        </w:rPr>
+        <w:t xml:space="preserve">srt://&lt;Station-address&gt;:10080?mode=caller&amp;latency=200</w:t>
+      </w:r>
+      <w:r>
+        <w:t xml:space="preserve"> </w:t>
+      </w:r>
+      <w:r>
+        <w:t xml:space="preserve">and the</w:t>
+      </w:r>
+      <w:r>
+        <w:t xml:space="preserve"> </w:t>
+      </w:r>
+      <w:r>
+        <w:t xml:space="preserve">same passphrase through CivicCast’s existing credential control. Do</w:t>
+      </w:r>
+      <w:r>
+        <w:t xml:space="preserve"> </w:t>
+      </w:r>
+      <w:r>
+        <w:rPr>
+          <w:b/>
+          <w:bCs/>
+        </w:rPr>
+        <w:t xml:space="preserve">not</w:t>
+      </w:r>
+      <w:r>
+        <w:t xml:space="preserve"> </w:t>
+      </w:r>
+      <w:r>
+        <w:t xml:space="preserve">put</w:t>
+      </w:r>
+      <w:r>
+        <w:t xml:space="preserve"> </w:t>
+      </w:r>
+      <w:r>
+        <w:t xml:space="preserve">the passphrase in the URI. Station’s listener uses 128-bit SRT encryption.</w:t>
+      </w:r>
+      <w:r>
+        <w:t xml:space="preserve"> </w:t>
+      </w:r>
+      <w:r>
+        <w:t xml:space="preserve">Keep the two accounts and configuration stores separate; matching this specific</w:t>
+      </w:r>
+      <w:r>
+        <w:t xml:space="preserve"> </w:t>
+      </w:r>
+      <w:r>
+        <w:t xml:space="preserve">transport credential is the deliberate pairing. Site-specific camera, headend</w:t>
+      </w:r>
+      <w:r>
+        <w:t xml:space="preserve"> </w:t>
+      </w:r>
+      <w:r>
+        <w:t xml:space="preserve">and firewall commissioning remain deployment work.</w:t>
+      </w:r>
+    </w:p>
+    <w:p>
+      <w:pPr>
+        <w:pStyle w:val="BodyText"/>
+      </w:pPr>
+      <w:r>
+        <w:t xml:space="preserve">For completed uploads, configure these</w:t>
+      </w:r>
+      <w:r>
+        <w:t xml:space="preserve"> </w:t>
+      </w:r>
+      <w:r>
+        <w:rPr>
+          <w:b/>
+          <w:bCs/>
+        </w:rPr>
+        <w:t xml:space="preserve">Station-only</w:t>
+      </w:r>
+      <w:r>
+        <w:t xml:space="preserve"> </w:t>
+      </w:r>
+      <w:r>
+        <w:t xml:space="preserve">environment variables in</w:t>
+      </w:r>
+      <w:r>
+        <w:t xml:space="preserve"> </w:t>
+      </w:r>
+      <w:r>
+        <w:t xml:space="preserve">the upload worker process. Obtain OAuth authorization for the intended Station</w:t>
+      </w:r>
+      <w:r>
+        <w:t xml:space="preserve"> </w:t>
+      </w:r>
+      <w:r>
+        <w:t xml:space="preserve">YouTube channel/account through the existing deployment’s Google configuration;</w:t>
+      </w:r>
+      <w:r>
+        <w:t xml:space="preserve"> </w:t>
+      </w:r>
+      <w:r>
+        <w:t xml:space="preserve">no OAuth onboarding framework is added here. Do not use CivicCast’s credentials</w:t>
+      </w:r>
+      <w:r>
+        <w:t xml:space="preserve"> </w:t>
+      </w:r>
+      <w:r>
+        <w:t xml:space="preserve">implicitly or copy its profile.</w:t>
+      </w:r>
+    </w:p>
+    <w:p>
+      <w:pPr>
+        <w:pStyle w:val="Compact"/>
+        <w:numPr>
+          <w:ilvl w:val="0"/>
+          <w:numId w:val="1005"/>
+        </w:numPr>
+      </w:pPr>
+      <w:r>
+        <w:rPr>
+          <w:rStyle w:val="VerbatimChar"/>
+        </w:rPr>
+        <w:t xml:space="preserve">TOWNLIGHT_STATION_YOUTUBE_CLIENT_ID</w:t>
+      </w:r>
+    </w:p>
+    <w:p>
+      <w:pPr>
+        <w:pStyle w:val="Compact"/>
+        <w:numPr>
+          <w:ilvl w:val="0"/>
+          <w:numId w:val="1005"/>
+        </w:numPr>
+      </w:pPr>
+      <w:r>
+        <w:rPr>
+          <w:rStyle w:val="VerbatimChar"/>
+        </w:rPr>
+        <w:t xml:space="preserve">TOWNLIGHT_STATION_YOUTUBE_CLIENT_SECRET</w:t>
+      </w:r>
+    </w:p>
+    <w:p>
+      <w:pPr>
+        <w:pStyle w:val="Compact"/>
+        <w:numPr>
+          <w:ilvl w:val="0"/>
+          <w:numId w:val="1005"/>
+        </w:numPr>
+      </w:pPr>
+      <w:r>
+        <w:rPr>
+          <w:rStyle w:val="VerbatimChar"/>
+        </w:rPr>
+        <w:t xml:space="preserve">TOWNLIGHT_STATION_YOUTUBE_REFRESH_TOKEN</w:t>
+      </w:r>
+      <w:r>
+        <w:t xml:space="preserve"> </w:t>
+      </w:r>
+      <w:r>
+        <w:t xml:space="preserve">(authorized for YouTube video uploads)</w:t>
+      </w:r>
+    </w:p>
+    <w:p>
+      <w:pPr>
+        <w:pStyle w:val="FirstParagraph"/>
+      </w:pPr>
+      <w:r>
+        <w:t xml:space="preserve">Run the existing</w:t>
+      </w:r>
+      <w:r>
+        <w:t xml:space="preserve"> </w:t>
+      </w:r>
+      <w:r>
+        <w:rPr>
+          <w:rStyle w:val="VerbatimChar"/>
+        </w:rPr>
+        <w:t xml:space="preserve">serve</w:t>
+      </w:r>
+      <w:r>
+        <w:t xml:space="preserve"> </w:t>
+      </w:r>
+      <w:r>
+        <w:t xml:space="preserve">and capture</w:t>
+      </w:r>
+      <w:r>
+        <w:t xml:space="preserve"> </w:t>
+      </w:r>
+      <w:r>
+        <w:rPr>
+          <w:rStyle w:val="VerbatimChar"/>
+        </w:rPr>
+        <w:t xml:space="preserve">worker</w:t>
+      </w:r>
+      <w:r>
+        <w:t xml:space="preserve">, plus the separate upload consumer</w:t>
+      </w:r>
+      <w:r>
+        <w:t xml:space="preserve"> </w:t>
+      </w:r>
+      <w:r>
+        <w:t xml:space="preserve">with the same Station settings and dedicated database:</w:t>
+      </w:r>
+    </w:p>
+    <w:p>
+      <w:pPr>
+        <w:pStyle w:val="SourceCode"/>
+      </w:pPr>
+      <w:r>
+        <w:rPr>
+          <w:rStyle w:val="NormalTok"/>
+        </w:rPr>
+        <w:t xml:space="preserve">townlight-station migrate</w:t>
+      </w:r>
+      <w:r>
+        <w:br/>
+      </w:r>
+      <w:r>
+        <w:rPr>
+          <w:rStyle w:val="NormalTok"/>
+        </w:rPr>
+        <w:t xml:space="preserve">townlight-station serve</w:t>
+      </w:r>
+      <w:r>
+        <w:br/>
+      </w:r>
+      <w:r>
+        <w:rPr>
+          <w:rStyle w:val="CommentTok"/>
+        </w:rPr>
+        <w:t xml:space="preserve"># In separate managed processes with the same explicit Station configuration:</w:t>
+      </w:r>
+      <w:r>
+        <w:br/>
+      </w:r>
+      <w:r>
+        <w:rPr>
+          <w:rStyle w:val="NormalTok"/>
+        </w:rPr>
+        <w:t xml:space="preserve">townlight-station worker</w:t>
+      </w:r>
+      <w:r>
+        <w:br/>
+      </w:r>
+      <w:r>
+        <w:rPr>
+          <w:rStyle w:val="NormalTok"/>
+        </w:rPr>
+        <w:t xml:space="preserve">townlight-station uploads</w:t>
+      </w:r>
+    </w:p>
+    <w:p>
+      <w:pPr>
+        <w:pStyle w:val="FirstParagraph"/>
+      </w:pPr>
+      <w:r>
+        <w:t xml:space="preserve">These are deployment commands,</w:t>
+      </w:r>
+      <w:r>
+        <w:t xml:space="preserve"> </w:t>
+      </w:r>
+      <w:r>
+        <w:rPr>
+          <w:b/>
+          <w:bCs/>
+        </w:rPr>
+        <w:t xml:space="preserve">not commands executed against installed apps</w:t>
+      </w:r>
+      <w:r>
+        <w:rPr>
+          <w:b/>
+          <w:bCs/>
+        </w:rPr>
+        <w:t xml:space="preserve"> </w:t>
+      </w:r>
+      <w:r>
+        <w:rPr>
+          <w:b/>
+          <w:bCs/>
+        </w:rPr>
+        <w:t xml:space="preserve">by this development task</w:t>
+      </w:r>
+      <w:r>
+        <w:t xml:space="preserve">. Run only one capture worker and one upload worker per</w:t>
+      </w:r>
+      <w:r>
+        <w:t xml:space="preserve"> </w:t>
+      </w:r>
+      <w:r>
+        <w:t xml:space="preserve">database. Each holds a distinct advisory lock; media children require the existing</w:t>
+      </w:r>
+      <w:r>
+        <w:t xml:space="preserve"> </w:t>
+      </w:r>
+      <w:r>
+        <w:t xml:space="preserve">Windows job containment. The recorder child gets no provider credentials; the</w:t>
+      </w:r>
+      <w:r>
+        <w:t xml:space="preserve"> </w:t>
+      </w:r>
+      <w:r>
+        <w:t xml:space="preserve">SRT child receives only its explicit transport passphrase plus the existing</w:t>
+      </w:r>
+      <w:r>
+        <w:t xml:space="preserve"> </w:t>
+      </w:r>
+      <w:r>
+        <w:t xml:space="preserve">runtime allowlist. The upload worker reads only the Station OAuth variables.</w:t>
+      </w:r>
+      <w:r>
+        <w:t xml:space="preserve"> </w:t>
+      </w:r>
+      <w:r>
+        <w:t xml:space="preserve">OAuth/upload HTTP is restricted to Google HTTPS hosts; redirects are not followed.</w:t>
+      </w:r>
+      <w:r>
+        <w:t xml:space="preserve"> </w:t>
+      </w:r>
+      <w:r>
+        <w:t xml:space="preserve">The pinned donor import is checked against Station’s declared media source.</w:t>
+      </w:r>
+    </w:p>
+    <w:bookmarkEnd w:id="104"/>
+    <w:bookmarkStart w:id="105" w:name="http-api-and-examples"/>
+    <w:p>
+      <w:pPr>
+        <w:pStyle w:val="Heading2"/>
+      </w:pPr>
+      <w:r>
+        <w:t xml:space="preserve">HTTP API and examples</w:t>
+      </w:r>
+    </w:p>
+    <w:p>
+      <w:pPr>
+        <w:pStyle w:val="FirstParagraph"/>
+      </w:pPr>
+      <w:r>
+        <w:t xml:space="preserve">All</w:t>
+      </w:r>
+      <w:r>
+        <w:t xml:space="preserve"> </w:t>
+      </w:r>
+      <w:r>
+        <w:rPr>
+          <w:rStyle w:val="VerbatimChar"/>
+        </w:rPr>
+        <w:t xml:space="preserve">/v1</w:t>
+      </w:r>
+      <w:r>
+        <w:t xml:space="preserve"> </w:t>
+      </w:r>
+      <w:r>
+        <w:t xml:space="preserve">operations below require the existing current Townlight staff session</w:t>
+      </w:r>
+      <w:r>
+        <w:t xml:space="preserve"> </w:t>
+      </w:r>
+      <w:r>
+        <w:t xml:space="preserve">header (</w:t>
+      </w:r>
+      <w:r>
+        <w:rPr>
+          <w:rStyle w:val="VerbatimChar"/>
+        </w:rPr>
+        <w:t xml:space="preserve">X-Townlight-Session</w:t>
+      </w:r>
+      <w:r>
+        <w:t xml:space="preserve">) or the existing same-origin operator session. Read</w:t>
+      </w:r>
+      <w:r>
+        <w:t xml:space="preserve"> </w:t>
+      </w:r>
+      <w:r>
+        <w:t xml:space="preserve">roles can inspect receipts. Starting live feed/upload/retry requires the existing</w:t>
+      </w:r>
+      <w:r>
+        <w:t xml:space="preserve"> </w:t>
+      </w:r>
+      <w:r>
+        <w:t xml:space="preserve">Station</w:t>
+      </w:r>
+      <w:r>
+        <w:t xml:space="preserve"> </w:t>
+      </w:r>
+      <w:r>
+        <w:rPr>
+          <w:rStyle w:val="VerbatimChar"/>
+        </w:rPr>
+        <w:t xml:space="preserve">capture</w:t>
+      </w:r>
+      <w:r>
+        <w:t xml:space="preserve"> </w:t>
+      </w:r>
+      <w:r>
+        <w:t xml:space="preserve">capability. No new login, role system or MCP server is added.</w:t>
+      </w:r>
+    </w:p>
+    <w:tbl>
+      <w:tblPr>
+        <w:tblStyle w:val="Table"/>
+        <w:tblW w:type="pct" w:w="5000"/>
+        <w:tblLayout w:type="fixed"/>
+        <w:tblLook w:firstRow="1" w:lastRow="0" w:firstColumn="0" w:lastColumn="0" w:noHBand="0" w:noVBand="0" w:val="0020"/>
+      </w:tblPr>
+      <w:tblGrid>
+        <w:gridCol w:w="2880"/>
+        <w:gridCol w:w="7344"/>
+      </w:tblGrid>
+      <w:tr>
+        <w:trPr>
+          <w:tblHeader w:val="on"/>
+        </w:trPr>
+        <w:tc>
+          <w:tcPr>
+            <w:tcW w:type="dxa" w:w="2880"/>
+            <w:tcMar>
+              <w:top w:w="90" w:type="dxa"/>
+              <w:left w:w="90" w:type="dxa"/>
+              <w:bottom w:w="90" w:type="dxa"/>
+              <w:right w:w="90" w:type="dxa"/>
+            </w:tcMar>
+            <w:shd w:fill="F1F6F5"/>
+          </w:tcPr>
+          <w:p>
+            <w:pPr>
+              <w:pStyle w:val="Compact"/>
+            </w:pPr>
+            <w:r>
+              <w:rPr>
+                <w:sz w:val="18"/>
+              </w:rPr>
+              <w:t xml:space="preserve">Method and route</w:t>
+            </w:r>
+          </w:p>
+        </w:tc>
+        <w:tc>
+          <w:tcPr>
+            <w:tcW w:type="dxa" w:w="7344"/>
+            <w:tcMar>
+              <w:top w:w="90" w:type="dxa"/>
+              <w:left w:w="90" w:type="dxa"/>
+              <w:bottom w:w="90" w:type="dxa"/>
+              <w:right w:w="90" w:type="dxa"/>
+            </w:tcMar>
+            <w:shd w:fill="F1F6F5"/>
+          </w:tcPr>
+          <w:p>
+            <w:pPr>
+              <w:pStyle w:val="Compact"/>
+            </w:pPr>
+            <w:r>
+              <w:rPr>
+                <w:sz w:val="18"/>
+              </w:rPr>
+              <w:t xml:space="preserve">Purpose</w:t>
+            </w:r>
+          </w:p>
+        </w:tc>
+      </w:tr>
+      <w:tr>
+        <w:tc>
+          <w:tcPr>
+            <w:tcW w:type="dxa" w:w="2880"/>
+            <w:tcMar>
+              <w:top w:w="90" w:type="dxa"/>
+              <w:left w:w="90" w:type="dxa"/>
+              <w:bottom w:w="90" w:type="dxa"/>
+              <w:right w:w="90" w:type="dxa"/>
+            </w:tcMar>
+          </w:tcPr>
+          <w:p>
+            <w:pPr>
+              <w:pStyle w:val="Compact"/>
+            </w:pPr>
+            <w:r>
+              <w:rPr>
+                <w:sz w:val="18"/>
+              </w:rPr>
+              <w:t xml:space="preserve">GET</w:t>
+            </w:r>
+            <w:r>
+              <w:rPr>
+                <w:sz w:val="18"/>
+              </w:rPr>
+              <w:t xml:space="preserve"> </w:t>
+            </w:r>
+            <w:r>
+              <w:rPr>
+                <w:rStyle w:val="VerbatimChar"/>
+                <w:sz w:val="18"/>
+              </w:rPr>
+              <w:t xml:space="preserve">/v1/civiccast-feeds</w:t>
+            </w:r>
+          </w:p>
+        </w:tc>
+        <w:tc>
+          <w:tcPr>
+            <w:tcW w:type="dxa" w:w="7344"/>
+            <w:tcMar>
+              <w:top w:w="90" w:type="dxa"/>
+              <w:left w:w="90" w:type="dxa"/>
+              <w:bottom w:w="90" w:type="dxa"/>
+              <w:right w:w="90" w:type="dxa"/>
+            </w:tcMar>
+          </w:tcPr>
+          <w:p>
+            <w:pPr>
+              <w:pStyle w:val="Compact"/>
+            </w:pPr>
+            <w:r>
+              <w:rPr>
+                <w:sz w:val="18"/>
+              </w:rPr>
+              <w:t xml:space="preserve">Capture-authorized list of configured IDs and labels; no transport credentials</w:t>
+            </w:r>
+          </w:p>
+        </w:tc>
+      </w:tr>
+      <w:tr>
+        <w:tc>
+          <w:tcPr>
+            <w:tcW w:type="dxa" w:w="2880"/>
+            <w:tcMar>
+              <w:top w:w="90" w:type="dxa"/>
+              <w:left w:w="90" w:type="dxa"/>
+              <w:bottom w:w="90" w:type="dxa"/>
+              <w:right w:w="90" w:type="dxa"/>
+            </w:tcMar>
+          </w:tcPr>
+          <w:p>
+            <w:pPr>
+              <w:pStyle w:val="Compact"/>
+            </w:pPr>
+            <w:r>
+              <w:rPr>
+                <w:sz w:val="18"/>
+              </w:rPr>
+              <w:t xml:space="preserve">POST</w:t>
+            </w:r>
+            <w:r>
+              <w:rPr>
+                <w:sz w:val="18"/>
+              </w:rPr>
+              <w:t xml:space="preserve"> </w:t>
+            </w:r>
+            <w:r>
+              <w:rPr>
+                <w:rStyle w:val="VerbatimChar"/>
+                <w:sz w:val="18"/>
+              </w:rPr>
+              <w:t xml:space="preserve">/v1/recordings</w:t>
+            </w:r>
+          </w:p>
+        </w:tc>
+        <w:tc>
+          <w:tcPr>
+            <w:tcW w:type="dxa" w:w="7344"/>
+            <w:tcMar>
+              <w:top w:w="90" w:type="dxa"/>
+              <w:left w:w="90" w:type="dxa"/>
+              <w:bottom w:w="90" w:type="dxa"/>
+              <w:right w:w="90" w:type="dxa"/>
+            </w:tcMar>
+          </w:tcPr>
+          <w:p>
+            <w:pPr>
+              <w:pStyle w:val="Compact"/>
+            </w:pPr>
+            <w:r>
+              <w:rPr>
+                <w:sz w:val="18"/>
+              </w:rPr>
+              <w:t xml:space="preserve">Existing capture contract plus optional</w:t>
+            </w:r>
+            <w:r>
+              <w:rPr>
+                <w:sz w:val="18"/>
+              </w:rPr>
+              <w:t xml:space="preserve"> </w:t>
+            </w:r>
+            <w:r>
+              <w:rPr>
+                <w:rStyle w:val="VerbatimChar"/>
+                <w:sz w:val="18"/>
+              </w:rPr>
+              <w:t xml:space="preserve">civiccast_feed_id</w:t>
+            </w:r>
+            <w:r>
+              <w:rPr>
+                <w:sz w:val="18"/>
+              </w:rPr>
+              <w:t xml:space="preserve">, allowed only with</w:t>
+            </w:r>
+            <w:r>
+              <w:rPr>
+                <w:sz w:val="18"/>
+              </w:rPr>
+              <w:t xml:space="preserve"> </w:t>
+            </w:r>
+            <w:r>
+              <w:rPr>
+                <w:rStyle w:val="VerbatimChar"/>
+                <w:sz w:val="18"/>
+              </w:rPr>
+              <w:t xml:space="preserve">live_source_id</w:t>
+            </w:r>
+          </w:p>
+        </w:tc>
+      </w:tr>
+      <w:tr>
+        <w:tc>
+          <w:tcPr>
+            <w:tcW w:type="dxa" w:w="2880"/>
+            <w:tcMar>
+              <w:top w:w="90" w:type="dxa"/>
+              <w:left w:w="90" w:type="dxa"/>
+              <w:bottom w:w="90" w:type="dxa"/>
+              <w:right w:w="90" w:type="dxa"/>
+            </w:tcMar>
+          </w:tcPr>
+          <w:p>
+            <w:pPr>
+              <w:pStyle w:val="Compact"/>
+            </w:pPr>
+            <w:r>
+              <w:rPr>
+                <w:sz w:val="18"/>
+              </w:rPr>
+              <w:t xml:space="preserve">POST</w:t>
+            </w:r>
+            <w:r>
+              <w:rPr>
+                <w:sz w:val="18"/>
+              </w:rPr>
+              <w:t xml:space="preserve"> </w:t>
+            </w:r>
+            <w:r>
+              <w:rPr>
+                <w:rStyle w:val="VerbatimChar"/>
+                <w:sz w:val="18"/>
+              </w:rPr>
+              <w:t xml:space="preserve">/v1/recordings/{recording_id}/youtube</w:t>
+            </w:r>
+          </w:p>
+        </w:tc>
+        <w:tc>
+          <w:tcPr>
+            <w:tcW w:type="dxa" w:w="7344"/>
+            <w:tcMar>
+              <w:top w:w="90" w:type="dxa"/>
+              <w:left w:w="90" w:type="dxa"/>
+              <w:bottom w:w="90" w:type="dxa"/>
+              <w:right w:w="90" w:type="dxa"/>
+            </w:tcMar>
+          </w:tcPr>
+          <w:p>
+            <w:pPr>
+              <w:pStyle w:val="Compact"/>
+            </w:pPr>
+            <w:r>
+              <w:rPr>
+                <w:sz w:val="18"/>
+              </w:rPr>
+              <w:t xml:space="preserve">Queue one explicit completed-recording upload</w:t>
+            </w:r>
+          </w:p>
+        </w:tc>
+      </w:tr>
+      <w:tr>
+        <w:tc>
+          <w:tcPr>
+            <w:tcW w:type="dxa" w:w="2880"/>
+            <w:tcMar>
+              <w:top w:w="90" w:type="dxa"/>
+              <w:left w:w="90" w:type="dxa"/>
+              <w:bottom w:w="90" w:type="dxa"/>
+              <w:right w:w="90" w:type="dxa"/>
+            </w:tcMar>
+          </w:tcPr>
+          <w:p>
+            <w:pPr>
+              <w:pStyle w:val="Compact"/>
+            </w:pPr>
+            <w:r>
+              <w:rPr>
+                <w:sz w:val="18"/>
+              </w:rPr>
+              <w:t xml:space="preserve">GET</w:t>
+            </w:r>
+            <w:r>
+              <w:rPr>
+                <w:sz w:val="18"/>
+              </w:rPr>
+              <w:t xml:space="preserve"> </w:t>
+            </w:r>
+            <w:r>
+              <w:rPr>
+                <w:rStyle w:val="VerbatimChar"/>
+                <w:sz w:val="18"/>
+              </w:rPr>
+              <w:t xml:space="preserve">/v1/youtube-uploads</w:t>
+            </w:r>
+          </w:p>
+        </w:tc>
+        <w:tc>
+          <w:tcPr>
+            <w:tcW w:type="dxa" w:w="7344"/>
+            <w:tcMar>
+              <w:top w:w="90" w:type="dxa"/>
+              <w:left w:w="90" w:type="dxa"/>
+              <w:bottom w:w="90" w:type="dxa"/>
+              <w:right w:w="90" w:type="dxa"/>
+            </w:tcMar>
+          </w:tcPr>
+          <w:p>
+            <w:pPr>
+              <w:pStyle w:val="Compact"/>
+            </w:pPr>
+            <w:r>
+              <w:rPr>
+                <w:sz w:val="18"/>
+              </w:rPr>
+              <w:t xml:space="preserve">Read-authorized latest 100 durable upload receipts</w:t>
+            </w:r>
+          </w:p>
+        </w:tc>
+      </w:tr>
+      <w:tr>
+        <w:tc>
+          <w:tcPr>
+            <w:tcW w:type="dxa" w:w="2880"/>
+            <w:tcMar>
+              <w:top w:w="90" w:type="dxa"/>
+              <w:left w:w="90" w:type="dxa"/>
+              <w:bottom w:w="90" w:type="dxa"/>
+              <w:right w:w="90" w:type="dxa"/>
+            </w:tcMar>
+          </w:tcPr>
+          <w:p>
+            <w:pPr>
+              <w:pStyle w:val="Compact"/>
+            </w:pPr>
+            <w:r>
+              <w:rPr>
+                <w:sz w:val="18"/>
+              </w:rPr>
+              <w:t xml:space="preserve">POST</w:t>
+            </w:r>
+            <w:r>
+              <w:rPr>
+                <w:sz w:val="18"/>
+              </w:rPr>
+              <w:t xml:space="preserve"> </w:t>
+            </w:r>
+            <w:r>
+              <w:rPr>
+                <w:rStyle w:val="VerbatimChar"/>
+                <w:sz w:val="18"/>
+              </w:rPr>
+              <w:t xml:space="preserve">/v1/youtube-uploads/{upload_id}/retry</w:t>
+            </w:r>
+          </w:p>
+        </w:tc>
+        <w:tc>
+          <w:tcPr>
+            <w:tcW w:type="dxa" w:w="7344"/>
+            <w:tcMar>
+              <w:top w:w="90" w:type="dxa"/>
+              <w:left w:w="90" w:type="dxa"/>
+              <w:bottom w:w="90" w:type="dxa"/>
+              <w:right w:w="90" w:type="dxa"/>
+            </w:tcMar>
+          </w:tcPr>
+          <w:p>
+            <w:pPr>
+              <w:pStyle w:val="Compact"/>
+            </w:pPr>
+            <w:r>
+              <w:rPr>
+                <w:sz w:val="18"/>
+              </w:rPr>
+              <w:t xml:space="preserve">Capture-authorized retry of a</w:t>
+            </w:r>
+            <w:r>
+              <w:rPr>
+                <w:sz w:val="18"/>
+              </w:rPr>
+              <w:t xml:space="preserve"> </w:t>
+            </w:r>
+            <w:r>
+              <w:rPr>
+                <w:b/>
+                <w:bCs/>
+                <w:sz w:val="18"/>
+              </w:rPr>
+              <w:t xml:space="preserve">preparation</w:t>
+            </w:r>
+            <w:r>
+              <w:rPr>
+                <w:sz w:val="18"/>
+              </w:rPr>
+              <w:t xml:space="preserve"> </w:t>
+            </w:r>
+            <w:r>
+              <w:rPr>
+                <w:sz w:val="18"/>
+              </w:rPr>
+              <w:t xml:space="preserve">failure only</w:t>
+            </w:r>
+          </w:p>
+        </w:tc>
+      </w:tr>
+    </w:tbl>
+    <w:p>
+      <w:pPr>
+        <w:pStyle w:val="BodyText"/>
+      </w:pPr>
+      <w:r>
+        <w:t xml:space="preserve">Station’s generated</w:t>
+      </w:r>
+      <w:r>
+        <w:t xml:space="preserve"> </w:t>
+      </w:r>
+      <w:r>
+        <w:rPr>
+          <w:rStyle w:val="VerbatimChar"/>
+        </w:rPr>
+        <w:t xml:space="preserve">/openapi.json</w:t>
+      </w:r>
+      <w:r>
+        <w:t xml:space="preserve"> </w:t>
+      </w:r>
+      <w:r>
+        <w:t xml:space="preserve">includes the new routes and request schemas.</w:t>
+      </w:r>
+      <w:r>
+        <w:t xml:space="preserve"> </w:t>
+      </w:r>
+      <w:r>
+        <w:t xml:space="preserve">Example bodies (use real canonical IDs from the selected deployment):</w:t>
+      </w:r>
+    </w:p>
+    <w:p>
+      <w:pPr>
+        <w:pStyle w:val="SourceCode"/>
+      </w:pPr>
+      <w:r>
+        <w:rPr>
+          <w:rStyle w:val="FunctionTok"/>
+        </w:rPr>
+        <w:t xml:space="preserve">{</w:t>
+      </w:r>
+      <w:r>
+        <w:br/>
+      </w:r>
+      <w:r>
+        <w:rPr>
+          <w:rStyle w:val="NormalTok"/>
+        </w:rPr>
+        <w:t xml:space="preserve">  </w:t>
+      </w:r>
+      <w:r>
+        <w:rPr>
+          <w:rStyle w:val="DataTypeTok"/>
+        </w:rPr>
+        <w:t xml:space="preserve">"meeting_id"</w:t>
+      </w:r>
+      <w:r>
+        <w:rPr>
+          <w:rStyle w:val="FunctionTok"/>
+        </w:rPr>
+        <w:t xml:space="preserve">:</w:t>
+      </w:r>
+      <w:r>
+        <w:rPr>
+          <w:rStyle w:val="NormalTok"/>
+        </w:rPr>
+        <w:t xml:space="preserve"> </w:t>
+      </w:r>
+      <w:r>
+        <w:rPr>
+          <w:rStyle w:val="StringTok"/>
+        </w:rPr>
+        <w:t xml:space="preserve">"11111111-1111-4111-8111-111111111111"</w:t>
+      </w:r>
+      <w:r>
+        <w:rPr>
+          <w:rStyle w:val="FunctionTok"/>
+        </w:rPr>
+        <w:t xml:space="preserve">,</w:t>
+      </w:r>
+      <w:r>
+        <w:br/>
+      </w:r>
+      <w:r>
+        <w:rPr>
+          <w:rStyle w:val="NormalTok"/>
+        </w:rPr>
+        <w:t xml:space="preserve">  </w:t>
+      </w:r>
+      <w:r>
+        <w:rPr>
+          <w:rStyle w:val="DataTypeTok"/>
+        </w:rPr>
+        <w:t xml:space="preserve">"agenda_ids"</w:t>
+      </w:r>
+      <w:r>
+        <w:rPr>
+          <w:rStyle w:val="FunctionTok"/>
+        </w:rPr>
+        <w:t xml:space="preserve">:</w:t>
+      </w:r>
+      <w:r>
+        <w:rPr>
+          <w:rStyle w:val="NormalTok"/>
+        </w:rPr>
+        <w:t xml:space="preserve"> </w:t>
+      </w:r>
+      <w:r>
+        <w:rPr>
+          <w:rStyle w:val="OtherTok"/>
+        </w:rPr>
+        <w:t xml:space="preserve">[]</w:t>
+      </w:r>
+      <w:r>
+        <w:rPr>
+          <w:rStyle w:val="FunctionTok"/>
+        </w:rPr>
+        <w:t xml:space="preserve">,</w:t>
+      </w:r>
+      <w:r>
+        <w:br/>
+      </w:r>
+      <w:r>
+        <w:rPr>
+          <w:rStyle w:val="NormalTok"/>
+        </w:rPr>
+        <w:t xml:space="preserve">  </w:t>
+      </w:r>
+      <w:r>
+        <w:rPr>
+          <w:rStyle w:val="DataTypeTok"/>
+        </w:rPr>
+        <w:t xml:space="preserve">"live_source_id"</w:t>
+      </w:r>
+      <w:r>
+        <w:rPr>
+          <w:rStyle w:val="FunctionTok"/>
+        </w:rPr>
+        <w:t xml:space="preserve">:</w:t>
+      </w:r>
+      <w:r>
+        <w:rPr>
+          <w:rStyle w:val="NormalTok"/>
+        </w:rPr>
+        <w:t xml:space="preserve"> </w:t>
+      </w:r>
+      <w:r>
+        <w:rPr>
+          <w:rStyle w:val="StringTok"/>
+        </w:rPr>
+        <w:t xml:space="preserve">"chamber"</w:t>
+      </w:r>
+      <w:r>
+        <w:rPr>
+          <w:rStyle w:val="FunctionTok"/>
+        </w:rPr>
+        <w:t xml:space="preserve">,</w:t>
+      </w:r>
+      <w:r>
+        <w:br/>
+      </w:r>
+      <w:r>
+        <w:rPr>
+          <w:rStyle w:val="NormalTok"/>
+        </w:rPr>
+        <w:t xml:space="preserve">  </w:t>
+      </w:r>
+      <w:r>
+        <w:rPr>
+          <w:rStyle w:val="DataTypeTok"/>
+        </w:rPr>
+        <w:t xml:space="preserve">"civiccast_feed_id"</w:t>
+      </w:r>
+      <w:r>
+        <w:rPr>
+          <w:rStyle w:val="FunctionTok"/>
+        </w:rPr>
+        <w:t xml:space="preserve">:</w:t>
+      </w:r>
+      <w:r>
+        <w:rPr>
+          <w:rStyle w:val="NormalTok"/>
+        </w:rPr>
+        <w:t xml:space="preserve"> </w:t>
+      </w:r>
+      <w:r>
+        <w:rPr>
+          <w:rStyle w:val="StringTok"/>
+        </w:rPr>
+        <w:t xml:space="preserve">"peg"</w:t>
+      </w:r>
+      <w:r>
+        <w:rPr>
+          <w:rStyle w:val="FunctionTok"/>
+        </w:rPr>
+        <w:t xml:space="preserve">,</w:t>
+      </w:r>
+      <w:r>
+        <w:br/>
+      </w:r>
+      <w:r>
+        <w:rPr>
+          <w:rStyle w:val="NormalTok"/>
+        </w:rPr>
+        <w:t xml:space="preserve">  </w:t>
+      </w:r>
+      <w:r>
+        <w:rPr>
+          <w:rStyle w:val="DataTypeTok"/>
+        </w:rPr>
+        <w:t xml:space="preserve">"idempotency_key"</w:t>
+      </w:r>
+      <w:r>
+        <w:rPr>
+          <w:rStyle w:val="FunctionTok"/>
+        </w:rPr>
+        <w:t xml:space="preserve">:</w:t>
+      </w:r>
+      <w:r>
+        <w:rPr>
+          <w:rStyle w:val="NormalTok"/>
+        </w:rPr>
+        <w:t xml:space="preserve"> </w:t>
+      </w:r>
+      <w:r>
+        <w:rPr>
+          <w:rStyle w:val="StringTok"/>
+        </w:rPr>
+        <w:t xml:space="preserve">"council-live-2026-10-30"</w:t>
+      </w:r>
+      <w:r>
+        <w:br/>
+      </w:r>
+      <w:r>
+        <w:rPr>
+          <w:rStyle w:val="FunctionTok"/>
+        </w:rPr>
+        <w:t xml:space="preserve">}</w:t>
+      </w:r>
+    </w:p>
+    <w:p>
+      <w:pPr>
+        <w:pStyle w:val="SourceCode"/>
+      </w:pPr>
+      <w:r>
+        <w:rPr>
+          <w:rStyle w:val="FunctionTok"/>
+        </w:rPr>
+        <w:t xml:space="preserve">{</w:t>
+      </w:r>
+      <w:r>
+        <w:br/>
+      </w:r>
+      <w:r>
+        <w:rPr>
+          <w:rStyle w:val="NormalTok"/>
+        </w:rPr>
+        <w:t xml:space="preserve">  </w:t>
+      </w:r>
+      <w:r>
+        <w:rPr>
+          <w:rStyle w:val="DataTypeTok"/>
+        </w:rPr>
+        <w:t xml:space="preserve">"title"</w:t>
+      </w:r>
+      <w:r>
+        <w:rPr>
+          <w:rStyle w:val="FunctionTok"/>
+        </w:rPr>
+        <w:t xml:space="preserve">:</w:t>
+      </w:r>
+      <w:r>
+        <w:rPr>
+          <w:rStyle w:val="NormalTok"/>
+        </w:rPr>
+        <w:t xml:space="preserve"> </w:t>
+      </w:r>
+      <w:r>
+        <w:rPr>
+          <w:rStyle w:val="StringTok"/>
+        </w:rPr>
+        <w:t xml:space="preserve">"City council meeting — 30 October 2026"</w:t>
+      </w:r>
+      <w:r>
+        <w:rPr>
+          <w:rStyle w:val="FunctionTok"/>
+        </w:rPr>
+        <w:t xml:space="preserve">,</w:t>
+      </w:r>
+      <w:r>
+        <w:br/>
+      </w:r>
+      <w:r>
+        <w:rPr>
+          <w:rStyle w:val="NormalTok"/>
+        </w:rPr>
+        <w:t xml:space="preserve">  </w:t>
+      </w:r>
+      <w:r>
+        <w:rPr>
+          <w:rStyle w:val="DataTypeTok"/>
+        </w:rPr>
+        <w:t xml:space="preserve">"privacy"</w:t>
+      </w:r>
+      <w:r>
+        <w:rPr>
+          <w:rStyle w:val="FunctionTok"/>
+        </w:rPr>
+        <w:t xml:space="preserve">:</w:t>
+      </w:r>
+      <w:r>
+        <w:rPr>
+          <w:rStyle w:val="NormalTok"/>
+        </w:rPr>
+        <w:t xml:space="preserve"> </w:t>
+      </w:r>
+      <w:r>
+        <w:rPr>
+          <w:rStyle w:val="StringTok"/>
+        </w:rPr>
+        <w:t xml:space="preserve">"private"</w:t>
+      </w:r>
+      <w:r>
+        <w:rPr>
+          <w:rStyle w:val="FunctionTok"/>
+        </w:rPr>
+        <w:t xml:space="preserve">,</w:t>
+      </w:r>
+      <w:r>
+        <w:br/>
+      </w:r>
+      <w:r>
+        <w:rPr>
+          <w:rStyle w:val="NormalTok"/>
+        </w:rPr>
+        <w:t xml:space="preserve">  </w:t>
+      </w:r>
+      <w:r>
+        <w:rPr>
+          <w:rStyle w:val="DataTypeTok"/>
+        </w:rPr>
+        <w:t xml:space="preserve">"approval_note"</w:t>
+      </w:r>
+      <w:r>
+        <w:rPr>
+          <w:rStyle w:val="FunctionTok"/>
+        </w:rPr>
+        <w:t xml:space="preserve">:</w:t>
+      </w:r>
+      <w:r>
+        <w:rPr>
+          <w:rStyle w:val="NormalTok"/>
+        </w:rPr>
+        <w:t xml:space="preserve"> </w:t>
+      </w:r>
+      <w:r>
+        <w:rPr>
+          <w:rStyle w:val="StringTok"/>
+        </w:rPr>
+        <w:t xml:space="preserve">"Reviewed completed recording for upload"</w:t>
+      </w:r>
+      <w:r>
+        <w:rPr>
+          <w:rStyle w:val="FunctionTok"/>
+        </w:rPr>
+        <w:t xml:space="preserve">,</w:t>
+      </w:r>
+      <w:r>
+        <w:br/>
+      </w:r>
+      <w:r>
+        <w:rPr>
+          <w:rStyle w:val="NormalTok"/>
+        </w:rPr>
+        <w:t xml:space="preserve">  </w:t>
+      </w:r>
+      <w:r>
+        <w:rPr>
+          <w:rStyle w:val="DataTypeTok"/>
+        </w:rPr>
+        <w:t xml:space="preserve">"idempotency_key"</w:t>
+      </w:r>
+      <w:r>
+        <w:rPr>
+          <w:rStyle w:val="FunctionTok"/>
+        </w:rPr>
+        <w:t xml:space="preserve">:</w:t>
+      </w:r>
+      <w:r>
+        <w:rPr>
+          <w:rStyle w:val="NormalTok"/>
+        </w:rPr>
+        <w:t xml:space="preserve"> </w:t>
+      </w:r>
+      <w:r>
+        <w:rPr>
+          <w:rStyle w:val="StringTok"/>
+        </w:rPr>
+        <w:t xml:space="preserve">"council-vod-2026-10-30"</w:t>
+      </w:r>
+      <w:r>
+        <w:br/>
+      </w:r>
+      <w:r>
+        <w:rPr>
+          <w:rStyle w:val="FunctionTok"/>
+        </w:rPr>
+        <w:t xml:space="preserve">}</w:t>
+      </w:r>
+    </w:p>
+    <w:p>
+      <w:pPr>
+        <w:pStyle w:val="FirstParagraph"/>
+      </w:pPr>
+      <w:r>
+        <w:t xml:space="preserve">Upload titles are 1–100 characters; control characters and angle brackets are</w:t>
+      </w:r>
+      <w:r>
+        <w:t xml:space="preserve"> </w:t>
+      </w:r>
+      <w:r>
+        <w:t xml:space="preserve">rejected. Visibility is private/unlisted/public; approval note 3–500 characters;</w:t>
+      </w:r>
+      <w:r>
+        <w:t xml:space="preserve"> </w:t>
+      </w:r>
+      <w:r>
+        <w:t xml:space="preserve">key 1–100 characters. Repeating the same key returns the same intent, a changed</w:t>
+      </w:r>
+      <w:r>
+        <w:t xml:space="preserve"> </w:t>
+      </w:r>
+      <w:r>
+        <w:t xml:space="preserve">request conflicts, and another key cannot duplicate an existing recording upload.</w:t>
+      </w:r>
+      <w:r>
+        <w:t xml:space="preserve"> </w:t>
+      </w:r>
+      <w:r>
+        <w:t xml:space="preserve">A missing/uncompleted/tampered recording is rejected before upload admission;</w:t>
+      </w:r>
+      <w:r>
+        <w:t xml:space="preserve"> </w:t>
+      </w:r>
+      <w:r>
+        <w:t xml:space="preserve">the worker independently verifies the recording hash before remuxing/sending.</w:t>
+      </w:r>
+      <w:r>
+        <w:t xml:space="preserve"> </w:t>
+      </w:r>
+      <w:r>
+        <w:t xml:space="preserve">Retained receipts include approving actor, note/time, recording hash, MP4 path/</w:t>
+      </w:r>
+      <w:r>
+        <w:t xml:space="preserve"> </w:t>
+      </w:r>
+      <w:r>
+        <w:t xml:space="preserve">hash/size, chosen title/privacy and provider video ID/URL after acknowledgement.</w:t>
+      </w:r>
+      <w:r>
+        <w:t xml:space="preserve"> </w:t>
+      </w:r>
+      <w:r>
+        <w:t xml:space="preserve">No OAuth token, passphrase or donor credential pointer is stored in receipts.</w:t>
+      </w:r>
+    </w:p>
+    <w:bookmarkEnd w:id="105"/>
+    <w:bookmarkStart w:id="106" w:name="recovery-and-limits"/>
+    <w:p>
+      <w:pPr>
+        <w:pStyle w:val="Heading2"/>
+      </w:pPr>
+      <w:r>
+        <w:t xml:space="preserve">Recovery and limits</w:t>
+      </w:r>
+    </w:p>
+    <w:p>
+      <w:pPr>
+        <w:pStyle w:val="FirstParagraph"/>
+      </w:pPr>
+      <w:r>
+        <w:t xml:space="preserve">A failed preparation (for example missing Station OAuth configuration or failed</w:t>
+      </w:r>
+      <w:r>
+        <w:t xml:space="preserve"> </w:t>
+      </w:r>
+      <w:r>
+        <w:t xml:space="preserve">remux) is</w:t>
+      </w:r>
+      <w:r>
+        <w:t xml:space="preserve"> </w:t>
+      </w:r>
+      <w:r>
+        <w:rPr>
+          <w:rStyle w:val="VerbatimChar"/>
+        </w:rPr>
+        <w:t xml:space="preserve">failed</w:t>
+      </w:r>
+      <w:r>
+        <w:t xml:space="preserve">; correct the cause and explicitly call its retry route. The</w:t>
+      </w:r>
+      <w:r>
+        <w:t xml:space="preserve"> </w:t>
+      </w:r>
+      <w:r>
+        <w:t xml:space="preserve">prior attempt files remain retained. Once any external request begins, an error</w:t>
+      </w:r>
+      <w:r>
+        <w:t xml:space="preserve"> </w:t>
+      </w:r>
+      <w:r>
+        <w:t xml:space="preserve">is conservatively</w:t>
+      </w:r>
+      <w:r>
+        <w:t xml:space="preserve"> </w:t>
+      </w:r>
+      <w:r>
+        <w:rPr>
+          <w:rStyle w:val="VerbatimChar"/>
+        </w:rPr>
+        <w:t xml:space="preserve">needs-reconciliation</w:t>
+      </w:r>
+      <w:r>
+        <w:t xml:space="preserve">. A worker restart also moves interrupted</w:t>
+      </w:r>
+      <w:r>
+        <w:t xml:space="preserve"> </w:t>
+      </w:r>
+      <w:r>
+        <w:rPr>
+          <w:rStyle w:val="VerbatimChar"/>
+        </w:rPr>
+        <w:t xml:space="preserve">running</w:t>
+      </w:r>
+      <w:r>
+        <w:t xml:space="preserve"> </w:t>
+      </w:r>
+      <w:r>
+        <w:t xml:space="preserve">uploads to that state. There is no automatic retry that could create a</w:t>
+      </w:r>
+      <w:r>
+        <w:t xml:space="preserve"> </w:t>
+      </w:r>
+      <w:r>
+        <w:t xml:space="preserve">duplicate YouTube video. Check YouTube Studio and the retained job before a human</w:t>
+      </w:r>
+      <w:r>
+        <w:t xml:space="preserve"> </w:t>
+      </w:r>
+      <w:r>
+        <w:t xml:space="preserve">chooses another external action. This increment provides no automatic remote</w:t>
+      </w:r>
+      <w:r>
+        <w:t xml:space="preserve"> </w:t>
+      </w:r>
+      <w:r>
+        <w:t xml:space="preserve">reconciliation/delete/reupload control. A valid uploaded link is retained even</w:t>
+      </w:r>
+      <w:r>
+        <w:t xml:space="preserve"> </w:t>
+      </w:r>
+      <w:r>
+        <w:t xml:space="preserve">if the capture worker is restarted. The existing recording/Records path does</w:t>
+      </w:r>
+      <w:r>
+        <w:t xml:space="preserve"> </w:t>
+      </w:r>
+      <w:r>
+        <w:t xml:space="preserve">not depend on the external upload succeeding.</w:t>
+      </w:r>
+    </w:p>
+    <w:p>
+      <w:pPr>
+        <w:pStyle w:val="BodyText"/>
+      </w:pPr>
+      <w:r>
+        <w:t xml:space="preserve">Live sender state is in the recording’s</w:t>
+      </w:r>
+      <w:r>
+        <w:t xml:space="preserve"> </w:t>
+      </w:r>
+      <w:r>
+        <w:rPr>
+          <w:rStyle w:val="VerbatimChar"/>
+        </w:rPr>
+        <w:t xml:space="preserve">details.civiccast_delivery</w:t>
+      </w:r>
+      <w:r>
+        <w:t xml:space="preserve">; its final</w:t>
+      </w:r>
+      <w:r>
+        <w:t xml:space="preserve"> </w:t>
+      </w:r>
+      <w:r>
+        <w:t xml:space="preserve">byte count and per-attempt status/log files stay with the private recording.</w:t>
+      </w:r>
+      <w:r>
+        <w:t xml:space="preserve"> </w:t>
+      </w:r>
+      <w:r>
+        <w:t xml:space="preserve">On capture-worker restart, an interrupted feed is marked interrupted rather</w:t>
+      </w:r>
+      <w:r>
+        <w:t xml:space="preserve"> </w:t>
+      </w:r>
+      <w:r>
+        <w:t xml:space="preserve">than left appearing to send. Stop/reap is bounded even if the network child hangs.</w:t>
+      </w:r>
+      <w:r>
+        <w:t xml:space="preserve"> </w:t>
+      </w:r>
+      <w:r>
+        <w:t xml:space="preserve">No feed is automatically re-aired after recovery.</w:t>
+      </w:r>
+    </w:p>
+    <w:bookmarkEnd w:id="106"/>
+    <w:bookmarkStart w:id="107" w:name="verification-and-release-status"/>
+    <w:p>
+      <w:pPr>
+        <w:pStyle w:val="Heading2"/>
+      </w:pPr>
+      <w:r>
+        <w:t xml:space="preserve">Verification and release status</w:t>
+      </w:r>
+    </w:p>
+    <w:p>
+      <w:pPr>
+        <w:pStyle w:val="FirstParagraph"/>
+      </w:pPr>
+      <w:r>
+        <w:rPr>
+          <w:rStyle w:val="VerbatimChar"/>
+        </w:rPr>
+        <w:t xml:space="preserve">tests/accept_deliveries.py</w:t>
+      </w:r>
+      <w:r>
+        <w:t xml:space="preserve"> </w:t>
+      </w:r>
+      <w:r>
+        <w:t xml:space="preserve">exercises the real Station API/store/media/remux,</w:t>
+      </w:r>
+      <w:r>
+        <w:t xml:space="preserve"> </w:t>
+      </w:r>
+      <w:r>
+        <w:t xml:space="preserve">CivicCast’s pinned SRT source adapter and real YouTube file-upload client using a</w:t>
+      </w:r>
+      <w:r>
+        <w:t xml:space="preserve"> </w:t>
+      </w:r>
+      <w:r>
+        <w:t xml:space="preserve">disposable PostgreSQL cluster, generated audio/video, synthetic staff authority</w:t>
+      </w:r>
+      <w:r>
+        <w:t xml:space="preserve"> </w:t>
+      </w:r>
+      <w:r>
+        <w:t xml:space="preserve">and</w:t>
+      </w:r>
+      <w:r>
+        <w:t xml:space="preserve"> </w:t>
+      </w:r>
+      <w:r>
+        <w:rPr>
+          <w:rStyle w:val="VerbatimChar"/>
+        </w:rPr>
+        <w:t xml:space="preserve">httpx.MockTransport</w:t>
+      </w:r>
+      <w:r>
+        <w:t xml:space="preserve"> </w:t>
+      </w:r>
+      <w:r>
+        <w:t xml:space="preserve">for Google. No city systems or external publication</w:t>
+      </w:r>
+      <w:r>
+        <w:t xml:space="preserve"> </w:t>
+      </w:r>
+      <w:r>
+        <w:t xml:space="preserve">are involved.</w:t>
+      </w:r>
+      <w:r>
+        <w:t xml:space="preserve"> </w:t>
+      </w:r>
+      <w:r>
+        <w:rPr>
+          <w:rStyle w:val="VerbatimChar"/>
+        </w:rPr>
+        <w:t xml:space="preserve">tests/accept_delivery_ui.cjs</w:t>
+      </w:r>
+      <w:r>
+        <w:t xml:space="preserve"> </w:t>
+      </w:r>
+      <w:r>
+        <w:t xml:space="preserve">drives the actual compiled operator</w:t>
+      </w:r>
+      <w:r>
+        <w:t xml:space="preserve"> </w:t>
+      </w:r>
+      <w:r>
+        <w:t xml:space="preserve">controls in headless Chromium with synthetic API responses. Existing boundary/</w:t>
+      </w:r>
+      <w:r>
+        <w:t xml:space="preserve"> </w:t>
+      </w:r>
+      <w:r>
+        <w:t xml:space="preserve">operations checks and TypeScript compilation also apply.</w:t>
+      </w:r>
+    </w:p>
+    <w:p>
+      <w:pPr>
+        <w:pStyle w:val="BodyText"/>
+      </w:pPr>
+      <w:r>
+        <w:t xml:space="preserve">Example invocation from a development environment with existing dependencies:</w:t>
+      </w:r>
+    </w:p>
+    <w:p>
+      <w:pPr>
+        <w:pStyle w:val="SourceCode"/>
+      </w:pPr>
+      <w:r>
+        <w:rPr>
+          <w:rStyle w:val="VariableTok"/>
+        </w:rPr>
+        <w:t xml:space="preserve">$env</w:t>
+      </w:r>
+      <w:r>
+        <w:rPr>
+          <w:rStyle w:val="OperatorTok"/>
+        </w:rPr>
+        <w:t xml:space="preserve">:</w:t>
+      </w:r>
+      <w:r>
+        <w:rPr>
+          <w:rStyle w:val="VariableTok"/>
+        </w:rPr>
+        <w:t xml:space="preserve">PYTHONPATH</w:t>
+      </w:r>
+      <w:r>
+        <w:rPr>
+          <w:rStyle w:val="NormalTok"/>
+        </w:rPr>
+        <w:t xml:space="preserve"> </w:t>
+      </w:r>
+      <w:r>
+        <w:rPr>
+          <w:rStyle w:val="OperatorTok"/>
+        </w:rPr>
+        <w:t xml:space="preserve">=</w:t>
+      </w:r>
+      <w:r>
+        <w:rPr>
+          <w:rStyle w:val="NormalTok"/>
+        </w:rPr>
+        <w:t xml:space="preserve"> </w:t>
+      </w:r>
+      <w:r>
+        <w:rPr>
+          <w:rStyle w:val="OperatorTok"/>
+        </w:rPr>
+        <w:t xml:space="preserve">(</w:t>
+      </w:r>
+      <w:r>
+        <w:rPr>
+          <w:rStyle w:val="FunctionTok"/>
+        </w:rPr>
+        <w:t xml:space="preserve">Resolve-Path</w:t>
+      </w:r>
+      <w:r>
+        <w:rPr>
+          <w:rStyle w:val="NormalTok"/>
+        </w:rPr>
+        <w:t xml:space="preserve"> </w:t>
+      </w:r>
+      <w:r>
+        <w:rPr>
+          <w:rStyle w:val="OperatorTok"/>
+        </w:rPr>
+        <w:t xml:space="preserve">./</w:t>
+      </w:r>
+      <w:r>
+        <w:rPr>
+          <w:rStyle w:val="NormalTok"/>
+        </w:rPr>
+        <w:t xml:space="preserve">beta-1</w:t>
+      </w:r>
+      <w:r>
+        <w:rPr>
+          <w:rStyle w:val="OperatorTok"/>
+        </w:rPr>
+        <w:t xml:space="preserve">).</w:t>
+      </w:r>
+      <w:r>
+        <w:rPr>
+          <w:rStyle w:val="FunctionTok"/>
+        </w:rPr>
+        <w:t xml:space="preserve">Path</w:t>
+      </w:r>
+      <w:r>
+        <w:br/>
+      </w:r>
+      <w:r>
+        <w:rPr>
+          <w:rStyle w:val="VariableTok"/>
+        </w:rPr>
+        <w:t xml:space="preserve">$env</w:t>
+      </w:r>
+      <w:r>
+        <w:rPr>
+          <w:rStyle w:val="OperatorTok"/>
+        </w:rPr>
+        <w:t xml:space="preserve">:</w:t>
+      </w:r>
+      <w:r>
+        <w:rPr>
+          <w:rStyle w:val="VariableTok"/>
+        </w:rPr>
+        <w:t xml:space="preserve">STATION_TEST_PG_BIN</w:t>
+      </w:r>
+      <w:r>
+        <w:rPr>
+          <w:rStyle w:val="NormalTok"/>
+        </w:rPr>
+        <w:t xml:space="preserve"> </w:t>
+      </w:r>
+      <w:r>
+        <w:rPr>
+          <w:rStyle w:val="OperatorTok"/>
+        </w:rPr>
+        <w:t xml:space="preserve">=</w:t>
+      </w:r>
+      <w:r>
+        <w:rPr>
+          <w:rStyle w:val="NormalTok"/>
+        </w:rPr>
+        <w:t xml:space="preserve"> </w:t>
+      </w:r>
+      <w:r>
+        <w:rPr>
+          <w:rStyle w:val="StringTok"/>
+        </w:rPr>
+        <w:t xml:space="preserve">'C:/test-tools/postgres/bin'</w:t>
+      </w:r>
+      <w:r>
+        <w:br/>
+      </w:r>
+      <w:r>
+        <w:rPr>
+          <w:rStyle w:val="VariableTok"/>
+        </w:rPr>
+        <w:t xml:space="preserve">$env</w:t>
+      </w:r>
+      <w:r>
+        <w:rPr>
+          <w:rStyle w:val="OperatorTok"/>
+        </w:rPr>
+        <w:t xml:space="preserve">:</w:t>
+      </w:r>
+      <w:r>
+        <w:rPr>
+          <w:rStyle w:val="VariableTok"/>
+        </w:rPr>
+        <w:t xml:space="preserve">STATION_TEST_MEDIA_RUNTIME</w:t>
+      </w:r>
+      <w:r>
+        <w:rPr>
+          <w:rStyle w:val="NormalTok"/>
+        </w:rPr>
+        <w:t xml:space="preserve"> </w:t>
+      </w:r>
+      <w:r>
+        <w:rPr>
+          <w:rStyle w:val="OperatorTok"/>
+        </w:rPr>
+        <w:t xml:space="preserve">=</w:t>
+      </w:r>
+      <w:r>
+        <w:rPr>
+          <w:rStyle w:val="NormalTok"/>
+        </w:rPr>
+        <w:t xml:space="preserve"> </w:t>
+      </w:r>
+      <w:r>
+        <w:rPr>
+          <w:rStyle w:val="StringTok"/>
+        </w:rPr>
+        <w:t xml:space="preserve">'C:/test-tools/station-media-runtime'</w:t>
+      </w:r>
+      <w:r>
+        <w:br/>
+      </w:r>
+      <w:r>
+        <w:rPr>
+          <w:rStyle w:val="NormalTok"/>
+        </w:rPr>
+        <w:t xml:space="preserve">python </w:t>
+      </w:r>
+      <w:r>
+        <w:rPr>
+          <w:rStyle w:val="OperatorTok"/>
+        </w:rPr>
+        <w:t xml:space="preserve">-</w:t>
+      </w:r>
+      <w:r>
+        <w:rPr>
+          <w:rStyle w:val="NormalTok"/>
+        </w:rPr>
+        <w:t xml:space="preserve">B </w:t>
+      </w:r>
+      <w:r>
+        <w:rPr>
+          <w:rStyle w:val="OperatorTok"/>
+        </w:rPr>
+        <w:t xml:space="preserve">./</w:t>
+      </w:r>
+      <w:r>
+        <w:rPr>
+          <w:rStyle w:val="NormalTok"/>
+        </w:rPr>
+        <w:t xml:space="preserve">beta-1</w:t>
+      </w:r>
+      <w:r>
+        <w:rPr>
+          <w:rStyle w:val="OperatorTok"/>
+        </w:rPr>
+        <w:t xml:space="preserve">/</w:t>
+      </w:r>
+      <w:r>
+        <w:rPr>
+          <w:rStyle w:val="NormalTok"/>
+        </w:rPr>
+        <w:t xml:space="preserve">tests</w:t>
+      </w:r>
+      <w:r>
+        <w:rPr>
+          <w:rStyle w:val="OperatorTok"/>
+        </w:rPr>
+        <w:t xml:space="preserve">/</w:t>
+      </w:r>
+      <w:r>
+        <w:rPr>
+          <w:rStyle w:val="NormalTok"/>
+        </w:rPr>
+        <w:t xml:space="preserve">accept_deliveries</w:t>
+      </w:r>
+      <w:r>
+        <w:rPr>
+          <w:rStyle w:val="OperatorTok"/>
+        </w:rPr>
+        <w:t xml:space="preserve">.</w:t>
+      </w:r>
+      <w:r>
+        <w:rPr>
+          <w:rStyle w:val="FunctionTok"/>
+        </w:rPr>
+        <w:t xml:space="preserve">py</w:t>
+      </w:r>
+      <w:r>
+        <w:rPr>
+          <w:rStyle w:val="NormalTok"/>
+        </w:rPr>
+        <w:t xml:space="preserve"> C</w:t>
+      </w:r>
+      <w:r>
+        <w:rPr>
+          <w:rStyle w:val="OperatorTok"/>
+        </w:rPr>
+        <w:t xml:space="preserve">:/</w:t>
+      </w:r>
+      <w:r>
+        <w:rPr>
+          <w:rStyle w:val="NormalTok"/>
+        </w:rPr>
+        <w:t xml:space="preserve">test-output</w:t>
+      </w:r>
+      <w:r>
+        <w:rPr>
+          <w:rStyle w:val="OperatorTok"/>
+        </w:rPr>
+        <w:t xml:space="preserve">/</w:t>
+      </w:r>
+      <w:r>
+        <w:rPr>
+          <w:rStyle w:val="NormalTok"/>
+        </w:rPr>
+        <w:t xml:space="preserve">station-deliveries-new</w:t>
+      </w:r>
+    </w:p>
+    <w:p>
+      <w:pPr>
+        <w:pStyle w:val="FirstParagraph"/>
+      </w:pPr>
+      <w:r>
+        <w:t xml:space="preserve">Use a</w:t>
+      </w:r>
+      <w:r>
+        <w:t xml:space="preserve"> </w:t>
+      </w:r>
+      <w:r>
+        <w:rPr>
+          <w:b/>
+          <w:bCs/>
+        </w:rPr>
+        <w:t xml:space="preserve">new</w:t>
+      </w:r>
+      <w:r>
+        <w:t xml:space="preserve"> </w:t>
+      </w:r>
+      <w:r>
+        <w:t xml:space="preserve">output directory; the script starts/stops only its owned disposable</w:t>
+      </w:r>
+      <w:r>
+        <w:t xml:space="preserve"> </w:t>
+      </w:r>
+      <w:r>
+        <w:t xml:space="preserve">cluster and children. See the task’s retained acceptance receipts for actual</w:t>
+      </w:r>
+      <w:r>
+        <w:t xml:space="preserve"> </w:t>
+      </w:r>
+      <w:r>
+        <w:t xml:space="preserve">results. This evidence establishes the new source wiring synthetically. It does</w:t>
+      </w:r>
+      <w:r>
+        <w:t xml:space="preserve"> </w:t>
+      </w:r>
+      <w:r>
+        <w:t xml:space="preserve">not replace CivicCast’s already established real YouTube delivery evidence, nor</w:t>
+      </w:r>
+      <w:r>
+        <w:t xml:space="preserve"> </w:t>
+      </w:r>
+      <w:r>
+        <w:t xml:space="preserve">claim a new real YouTube upload, physical cable broadcast, signed installer or</w:t>
+      </w:r>
+      <w:r>
+        <w:t xml:space="preserve"> </w:t>
+      </w:r>
+      <w:r>
+        <w:t xml:space="preserve">Sandbox acceptance of this extension. Published Beta 1 artifacts stay unchanged.</w:t>
+      </w:r>
+    </w:p>
+    <w:bookmarkEnd w:id="107"/>
+    <w:bookmarkEnd w:id="108"/>
+    <w:bookmarkStart w:id="109" w:name="delivery-subject-index"/>
+    <w:p>
+      <w:pPr>
+        <w:pStyle w:val="Heading1"/>
+      </w:pPr>
+      <w:r>
+        <w:t xml:space="preserve">Delivery subject index</w:t>
+      </w:r>
+    </w:p>
+    <w:p>
+      <w:pPr>
+        <w:pStyle w:val="Compact"/>
+        <w:numPr>
+          <w:ilvl w:val="0"/>
+          <w:numId w:val="1006"/>
+        </w:numPr>
+      </w:pPr>
+      <w:hyperlink w:anchor="X181e55796f60842f5722441cc567a4aa9d88047">
+        <w:r>
+          <w:rPr>
+            <w:rStyle w:val="Hyperlink"/>
+          </w:rPr>
+          <w:t xml:space="preserve">CivicCast live feed</w:t>
+        </w:r>
+      </w:hyperlink>
+    </w:p>
+    <w:p>
+      <w:pPr>
+        <w:pStyle w:val="Compact"/>
+        <w:numPr>
+          <w:ilvl w:val="0"/>
+          <w:numId w:val="1006"/>
+        </w:numPr>
+      </w:pPr>
+      <w:r>
+        <w:t xml:space="preserve">YouTube: explicit completed recording upload; visibility; receipt and reconciliation.</w:t>
+      </w:r>
+    </w:p>
+    <w:p>
+      <w:pPr>
+        <w:pStyle w:val="Compact"/>
+        <w:numPr>
+          <w:ilvl w:val="0"/>
+          <w:numId w:val="1006"/>
+        </w:numPr>
+      </w:pPr>
+      <w:r>
+        <w:t xml:space="preserve">Schema4: durable upload intent; existing evidence retained.</w:t>
+      </w:r>
+    </w:p>
+    <w:bookmarkEnd w:id="109"/>
     <w:sectPr>
       <w:headerReference r:id="rId9" w:type="default"/>
       <w:footerReference r:id="rId10" w:type="default"/>
@@ -16282,6 +19097,12 @@
     <w:abstractNumId w:val="991"/>
   </w:num>
   <w:num w:numId="1004">
+    <w:abstractNumId w:val="991"/>
+  </w:num>
+  <w:num w:numId="1005">
+    <w:abstractNumId w:val="991"/>
+  </w:num>
+  <w:num w:numId="1006">
     <w:abstractNumId w:val="991"/>
   </w:num>
 </w:numbering>

</xml_diff>